<commit_message>
fixed a few NPEs when importing managers and sending mails
</commit_message>
<xml_diff>
--- a/doc/SOFD Core - AD indlaesningsintegration.docx
+++ b/doc/SOFD Core - AD indlaesningsintegration.docx
@@ -152,7 +152,7 @@
         <w:t>1.</w:t>
       </w:r>
       <w:r>
-        <w:t>9</w:t>
+        <w:t>10</w:t>
       </w:r>
       <w:r>
         <w:t>.0</w:t>
@@ -174,7 +174,9 @@
       </w:r>
       <w:r>
         <w:tab/>
-        <w:t>07</w:t>
+      </w:r>
+      <w:r>
+        <w:t>03</w:t>
       </w:r>
       <w:r>
         <w:t>.</w:t>
@@ -183,7 +185,7 @@
         <w:t>0</w:t>
       </w:r>
       <w:r>
-        <w:t>3</w:t>
+        <w:t>1</w:t>
       </w:r>
       <w:r>
         <w:t>.20</w:t>
@@ -192,7 +194,7 @@
         <w:t>2</w:t>
       </w:r>
       <w:r>
-        <w:t>2</w:t>
+        <w:t>5</w:t>
       </w:r>
     </w:p>
     <w:p>
@@ -213,7 +215,7 @@
         <w:tab/>
       </w:r>
       <w:r>
-        <w:t>BSG</w:t>
+        <w:t>PSO</w:t>
       </w:r>
     </w:p>
     <w:p>
@@ -1126,7 +1128,23 @@
                 <w:noProof/>
                 <w:lang w:val="da-DK"/>
               </w:rPr>
-              <w:t>Konfiguration af service</w:t>
+              <w:t>Konfigu</w:t>
+            </w:r>
+            <w:r>
+              <w:rPr>
+                <w:rStyle w:val="Hyperlink"/>
+                <w:noProof/>
+                <w:lang w:val="da-DK"/>
+              </w:rPr>
+              <w:t>r</w:t>
+            </w:r>
+            <w:r>
+              <w:rPr>
+                <w:rStyle w:val="Hyperlink"/>
+                <w:noProof/>
+                <w:lang w:val="da-DK"/>
+              </w:rPr>
+              <w:t>ation af service</w:t>
             </w:r>
             <w:r>
               <w:rPr>
@@ -4656,7 +4674,7 @@
                 <w:sz w:val="16"/>
                 <w:szCs w:val="16"/>
               </w:rPr>
-              <w:t>”OU=old</w:t>
+              <w:t>OU=old</w:t>
             </w:r>
             <w:r>
               <w:rPr>
@@ -4743,7 +4761,7 @@
                 <w:sz w:val="16"/>
                 <w:szCs w:val="16"/>
               </w:rPr>
-              <w:t>=dk”</w:t>
+              <w:t>=dk</w:t>
             </w:r>
           </w:p>
         </w:tc>
@@ -4766,7 +4784,23 @@
                 <w:szCs w:val="16"/>
                 <w:lang w:val="da-DK"/>
               </w:rPr>
-              <w:t xml:space="preserve">En ;-separeret liste af enheders distinguished name. Brugere i enhederne, der listes her, bliver ikke synkroniseret.  </w:t>
+              <w:t xml:space="preserve">En </w:t>
+            </w:r>
+            <w:r>
+              <w:rPr>
+                <w:sz w:val="16"/>
+                <w:szCs w:val="16"/>
+                <w:lang w:val="da-DK"/>
+              </w:rPr>
+              <w:t>semikolon</w:t>
+            </w:r>
+            <w:r>
+              <w:rPr>
+                <w:sz w:val="16"/>
+                <w:szCs w:val="16"/>
+                <w:lang w:val="da-DK"/>
+              </w:rPr>
+              <w:t xml:space="preserve">-separeret liste af enheders distinguished name. Brugere i enhederne, der listes her, bliver ikke synkroniseret.  </w:t>
             </w:r>
           </w:p>
         </w:tc>
@@ -4774,19 +4808,26 @@
       <w:tr>
         <w:tc>
           <w:tcPr>
+            <w:cnfStyle w:val="001000000000" w:firstRow="0" w:lastRow="0" w:firstColumn="1" w:lastColumn="0" w:oddVBand="0" w:evenVBand="0" w:oddHBand="0" w:evenHBand="0" w:firstRowFirstColumn="0" w:firstRowLastColumn="0" w:lastRowFirstColumn="0" w:lastRowLastColumn="0"/>
             <w:tcW w:w="4248" w:type="dxa"/>
           </w:tcPr>
           <w:p>
             <w:pPr>
-              <w:cnfStyle w:val="001000000000" w:firstRow="0" w:lastRow="0" w:firstColumn="1" w:lastColumn="0" w:oddVBand="0" w:evenVBand="0" w:oddHBand="0" w:evenHBand="0" w:firstRowFirstColumn="0" w:firstRowLastColumn="0" w:lastRowFirstColumn="0" w:lastRowLastColumn="0"/>
+              <w:rPr>
+                <w:sz w:val="16"/>
+                <w:szCs w:val="16"/>
+              </w:rPr>
+            </w:pPr>
+            <w:proofErr w:type="spellStart"/>
+            <w:r>
               <w:rPr>
                 <w:b w:val="0"/>
                 <w:bCs w:val="0"/>
                 <w:sz w:val="16"/>
                 <w:szCs w:val="16"/>
               </w:rPr>
-            </w:pPr>
-            <w:proofErr w:type="spellStart"/>
+              <w:t>ActiveDirectory.</w:t>
+            </w:r>
             <w:r>
               <w:rPr>
                 <w:b w:val="0"/>
@@ -4794,6 +4835,225 @@
                 <w:sz w:val="16"/>
                 <w:szCs w:val="16"/>
               </w:rPr>
+              <w:t>In</w:t>
+            </w:r>
+            <w:r>
+              <w:rPr>
+                <w:b w:val="0"/>
+                <w:bCs w:val="0"/>
+                <w:sz w:val="16"/>
+                <w:szCs w:val="16"/>
+              </w:rPr>
+              <w:t>cludeOUs</w:t>
+            </w:r>
+            <w:proofErr w:type="spellEnd"/>
+          </w:p>
+        </w:tc>
+        <w:tc>
+          <w:tcPr>
+            <w:tcW w:w="1984" w:type="dxa"/>
+          </w:tcPr>
+          <w:p>
+            <w:pPr>
+              <w:cnfStyle w:val="000000000000" w:firstRow="0" w:lastRow="0" w:firstColumn="0" w:lastColumn="0" w:oddVBand="0" w:evenVBand="0" w:oddHBand="0" w:evenHBand="0" w:firstRowFirstColumn="0" w:firstRowLastColumn="0" w:lastRowFirstColumn="0" w:lastRowLastColumn="0"/>
+              <w:rPr>
+                <w:sz w:val="16"/>
+                <w:szCs w:val="16"/>
+              </w:rPr>
+            </w:pPr>
+            <w:r>
+              <w:rPr>
+                <w:sz w:val="16"/>
+                <w:szCs w:val="16"/>
+              </w:rPr>
+              <w:t xml:space="preserve">OU=old </w:t>
+            </w:r>
+            <w:proofErr w:type="spellStart"/>
+            <w:r>
+              <w:rPr>
+                <w:sz w:val="16"/>
+                <w:szCs w:val="16"/>
+              </w:rPr>
+              <w:t>users,OU</w:t>
+            </w:r>
+            <w:proofErr w:type="spellEnd"/>
+            <w:r>
+              <w:rPr>
+                <w:sz w:val="16"/>
+                <w:szCs w:val="16"/>
+              </w:rPr>
+              <w:t>=</w:t>
+            </w:r>
+            <w:proofErr w:type="spellStart"/>
+            <w:r>
+              <w:rPr>
+                <w:sz w:val="16"/>
+                <w:szCs w:val="16"/>
+              </w:rPr>
+              <w:t>testkøbing,DC</w:t>
+            </w:r>
+            <w:proofErr w:type="spellEnd"/>
+            <w:r>
+              <w:rPr>
+                <w:sz w:val="16"/>
+                <w:szCs w:val="16"/>
+              </w:rPr>
+              <w:t>=</w:t>
+            </w:r>
+            <w:proofErr w:type="spellStart"/>
+            <w:r>
+              <w:rPr>
+                <w:sz w:val="16"/>
+                <w:szCs w:val="16"/>
+              </w:rPr>
+              <w:t>test,DC</w:t>
+            </w:r>
+            <w:proofErr w:type="spellEnd"/>
+            <w:r>
+              <w:rPr>
+                <w:sz w:val="16"/>
+                <w:szCs w:val="16"/>
+              </w:rPr>
+              <w:t>=dk; OU=old users 2,OU=</w:t>
+            </w:r>
+            <w:proofErr w:type="spellStart"/>
+            <w:r>
+              <w:rPr>
+                <w:sz w:val="16"/>
+                <w:szCs w:val="16"/>
+              </w:rPr>
+              <w:t>testkøbing,DC</w:t>
+            </w:r>
+            <w:proofErr w:type="spellEnd"/>
+            <w:r>
+              <w:rPr>
+                <w:sz w:val="16"/>
+                <w:szCs w:val="16"/>
+              </w:rPr>
+              <w:t>=</w:t>
+            </w:r>
+            <w:proofErr w:type="spellStart"/>
+            <w:r>
+              <w:rPr>
+                <w:sz w:val="16"/>
+                <w:szCs w:val="16"/>
+              </w:rPr>
+              <w:t>test,DC</w:t>
+            </w:r>
+            <w:proofErr w:type="spellEnd"/>
+            <w:r>
+              <w:rPr>
+                <w:sz w:val="16"/>
+                <w:szCs w:val="16"/>
+              </w:rPr>
+              <w:t>=dk</w:t>
+            </w:r>
+          </w:p>
+        </w:tc>
+        <w:tc>
+          <w:tcPr>
+            <w:tcW w:w="3396" w:type="dxa"/>
+          </w:tcPr>
+          <w:p>
+            <w:pPr>
+              <w:cnfStyle w:val="000000000000" w:firstRow="0" w:lastRow="0" w:firstColumn="0" w:lastColumn="0" w:oddVBand="0" w:evenVBand="0" w:oddHBand="0" w:evenHBand="0" w:firstRowFirstColumn="0" w:firstRowLastColumn="0" w:lastRowFirstColumn="0" w:lastRowLastColumn="0"/>
+              <w:rPr>
+                <w:sz w:val="16"/>
+                <w:szCs w:val="16"/>
+                <w:lang w:val="da-DK"/>
+              </w:rPr>
+            </w:pPr>
+            <w:r>
+              <w:rPr>
+                <w:sz w:val="16"/>
+                <w:szCs w:val="16"/>
+                <w:lang w:val="da-DK"/>
+              </w:rPr>
+              <w:t xml:space="preserve">En </w:t>
+            </w:r>
+            <w:r>
+              <w:rPr>
+                <w:sz w:val="16"/>
+                <w:szCs w:val="16"/>
+                <w:lang w:val="da-DK"/>
+              </w:rPr>
+              <w:t>semikolon</w:t>
+            </w:r>
+            <w:r>
+              <w:rPr>
+                <w:sz w:val="16"/>
+                <w:szCs w:val="16"/>
+                <w:lang w:val="da-DK"/>
+              </w:rPr>
+              <w:t xml:space="preserve">-separeret liste af enheders distinguished name. </w:t>
+            </w:r>
+            <w:r>
+              <w:rPr>
+                <w:sz w:val="16"/>
+                <w:szCs w:val="16"/>
+                <w:lang w:val="da-DK"/>
+              </w:rPr>
+              <w:br/>
+              <w:t>Såfremt denne liste ikke er tom, er det kun b</w:t>
+            </w:r>
+            <w:r>
+              <w:rPr>
+                <w:sz w:val="16"/>
+                <w:szCs w:val="16"/>
+                <w:lang w:val="da-DK"/>
+              </w:rPr>
+              <w:t xml:space="preserve">rugere </w:t>
+            </w:r>
+            <w:r>
+              <w:rPr>
+                <w:sz w:val="16"/>
+                <w:szCs w:val="16"/>
+                <w:lang w:val="da-DK"/>
+              </w:rPr>
+              <w:t xml:space="preserve">under disse OUer der bliver </w:t>
+            </w:r>
+            <w:r>
+              <w:rPr>
+                <w:sz w:val="16"/>
+                <w:szCs w:val="16"/>
+                <w:lang w:val="da-DK"/>
+              </w:rPr>
+              <w:t>synkroniseret.</w:t>
+            </w:r>
+            <w:r>
+              <w:rPr>
+                <w:sz w:val="16"/>
+                <w:szCs w:val="16"/>
+                <w:lang w:val="da-DK"/>
+              </w:rPr>
+              <w:t xml:space="preserve"> </w:t>
+            </w:r>
+          </w:p>
+        </w:tc>
+      </w:tr>
+      <w:tr>
+        <w:tc>
+          <w:tcPr>
+            <w:cnfStyle w:val="001000000000" w:firstRow="0" w:lastRow="0" w:firstColumn="1" w:lastColumn="0" w:oddVBand="0" w:evenVBand="0" w:oddHBand="0" w:evenHBand="0" w:firstRowFirstColumn="0" w:firstRowLastColumn="0" w:lastRowFirstColumn="0" w:lastRowLastColumn="0"/>
+            <w:tcW w:w="4248" w:type="dxa"/>
+          </w:tcPr>
+          <w:p>
+            <w:pPr>
+              <w:rPr>
+                <w:b w:val="0"/>
+                <w:bCs w:val="0"/>
+                <w:sz w:val="16"/>
+                <w:szCs w:val="16"/>
+              </w:rPr>
+            </w:pPr>
+            <w:proofErr w:type="spellStart"/>
+            <w:r>
+              <w:rPr>
+                <w:b w:val="0"/>
+                <w:bCs w:val="0"/>
+                <w:sz w:val="16"/>
+                <w:szCs w:val="16"/>
+              </w:rPr>
               <w:t>ActiveDirectory.DisableAccountOrdersAttribute</w:t>
             </w:r>
             <w:proofErr w:type="spellEnd"/>
@@ -4805,6 +5065,7 @@
           </w:tcPr>
           <w:p>
             <w:pPr>
+              <w:cnfStyle w:val="000000000000" w:firstRow="0" w:lastRow="0" w:firstColumn="0" w:lastColumn="0" w:oddVBand="0" w:evenVBand="0" w:oddHBand="0" w:evenHBand="0" w:firstRowFirstColumn="0" w:firstRowLastColumn="0" w:lastRowFirstColumn="0" w:lastRowLastColumn="0"/>
               <w:rPr>
                 <w:sz w:val="16"/>
                 <w:szCs w:val="16"/>
@@ -4825,35 +5086,20 @@
           </w:tcPr>
           <w:p>
             <w:pPr>
-              <w:rPr>
-                <w:sz w:val="16"/>
-                <w:szCs w:val="16"/>
-                <w:lang w:val="da-DK"/>
-              </w:rPr>
-            </w:pPr>
-            <w:r>
-              <w:rPr>
-                <w:sz w:val="16"/>
-                <w:szCs w:val="16"/>
-                <w:lang w:val="da-DK"/>
-              </w:rPr>
-              <w:t xml:space="preserve">Såfremt den angive attribut er udfyldt med ”true” så vil integrationen sætte alle </w:t>
-            </w:r>
-            <w:r>
-              <w:rPr>
-                <w:sz w:val="16"/>
-                <w:szCs w:val="16"/>
-                <w:lang w:val="da-DK"/>
-              </w:rPr>
-              <w:t xml:space="preserve">IDM </w:t>
-            </w:r>
-            <w:r>
-              <w:rPr>
-                <w:sz w:val="16"/>
-                <w:szCs w:val="16"/>
-                <w:lang w:val="da-DK"/>
-              </w:rPr>
-              <w:t>undtagelsesmarkeringer på personen i OS2sofd.</w:t>
+              <w:cnfStyle w:val="000000000000" w:firstRow="0" w:lastRow="0" w:firstColumn="0" w:lastColumn="0" w:oddVBand="0" w:evenVBand="0" w:oddHBand="0" w:evenHBand="0" w:firstRowFirstColumn="0" w:firstRowLastColumn="0" w:lastRowFirstColumn="0" w:lastRowLastColumn="0"/>
+              <w:rPr>
+                <w:sz w:val="16"/>
+                <w:szCs w:val="16"/>
+                <w:lang w:val="da-DK"/>
+              </w:rPr>
+            </w:pPr>
+            <w:r>
+              <w:rPr>
+                <w:sz w:val="16"/>
+                <w:szCs w:val="16"/>
+                <w:lang w:val="da-DK"/>
+              </w:rPr>
+              <w:t>Såfremt den angive attribut er udfyldt med ”true” så vil integrationen sætte alle IDM undtagelsesmarkeringer på personen i OS2sofd.</w:t>
             </w:r>
             <w:r>
               <w:rPr>
@@ -4940,7 +5186,6 @@
           <w:tcPr>
             <w:cnfStyle w:val="001000000000" w:firstRow="0" w:lastRow="0" w:firstColumn="1" w:lastColumn="0" w:oddVBand="0" w:evenVBand="0" w:oddHBand="0" w:evenHBand="0" w:firstRowFirstColumn="0" w:firstRowLastColumn="0" w:lastRowFirstColumn="0" w:lastRowLastColumn="0"/>
             <w:tcW w:w="4248" w:type="dxa"/>
-            <w:shd w:val="clear" w:color="auto" w:fill="auto"/>
           </w:tcPr>
           <w:p>
             <w:pPr>
@@ -4967,7 +5212,6 @@
         <w:tc>
           <w:tcPr>
             <w:tcW w:w="1984" w:type="dxa"/>
-            <w:shd w:val="clear" w:color="auto" w:fill="auto"/>
           </w:tcPr>
           <w:p>
             <w:pPr>
@@ -4991,7 +5235,6 @@
         <w:tc>
           <w:tcPr>
             <w:tcW w:w="3396" w:type="dxa"/>
-            <w:shd w:val="clear" w:color="auto" w:fill="auto"/>
           </w:tcPr>
           <w:p>
             <w:pPr>
@@ -5018,7 +5261,6 @@
           <w:tcPr>
             <w:cnfStyle w:val="001000000000" w:firstRow="0" w:lastRow="0" w:firstColumn="1" w:lastColumn="0" w:oddVBand="0" w:evenVBand="0" w:oddHBand="0" w:evenHBand="0" w:firstRowFirstColumn="0" w:firstRowLastColumn="0" w:lastRowFirstColumn="0" w:lastRowLastColumn="0"/>
             <w:tcW w:w="4248" w:type="dxa"/>
-            <w:shd w:val="clear" w:color="auto" w:fill="auto"/>
           </w:tcPr>
           <w:p>
             <w:pPr>
@@ -5045,7 +5287,6 @@
         <w:tc>
           <w:tcPr>
             <w:tcW w:w="1984" w:type="dxa"/>
-            <w:shd w:val="clear" w:color="auto" w:fill="auto"/>
           </w:tcPr>
           <w:p>
             <w:pPr>
@@ -5072,7 +5313,6 @@
         <w:tc>
           <w:tcPr>
             <w:tcW w:w="3396" w:type="dxa"/>
-            <w:shd w:val="clear" w:color="auto" w:fill="auto"/>
           </w:tcPr>
           <w:p>
             <w:pPr>
@@ -5099,7 +5339,6 @@
           <w:tcPr>
             <w:cnfStyle w:val="001000000000" w:firstRow="0" w:lastRow="0" w:firstColumn="1" w:lastColumn="0" w:oddVBand="0" w:evenVBand="0" w:oddHBand="0" w:evenHBand="0" w:firstRowFirstColumn="0" w:firstRowLastColumn="0" w:lastRowFirstColumn="0" w:lastRowLastColumn="0"/>
             <w:tcW w:w="4248" w:type="dxa"/>
-            <w:shd w:val="clear" w:color="auto" w:fill="auto"/>
           </w:tcPr>
           <w:p>
             <w:pPr>
@@ -5126,7 +5365,6 @@
         <w:tc>
           <w:tcPr>
             <w:tcW w:w="1984" w:type="dxa"/>
-            <w:shd w:val="clear" w:color="auto" w:fill="auto"/>
           </w:tcPr>
           <w:p>
             <w:pPr>
@@ -5150,7 +5388,6 @@
         <w:tc>
           <w:tcPr>
             <w:tcW w:w="3396" w:type="dxa"/>
-            <w:shd w:val="clear" w:color="auto" w:fill="auto"/>
           </w:tcPr>
           <w:p>
             <w:pPr>
@@ -5190,6 +5427,7 @@
         <w:rPr>
           <w:lang w:val="da-DK"/>
         </w:rPr>
+        <w:lastRenderedPageBreak/>
         <w:t xml:space="preserve">Såfremt </w:t>
       </w:r>
       <w:r>
@@ -5223,7 +5461,6 @@
           <w:noProof/>
           <w:lang w:val="da-DK"/>
         </w:rPr>
-        <w:lastRenderedPageBreak/>
         <w:drawing>
           <wp:inline distT="0" distB="0" distL="0" distR="0" wp14:anchorId="25B9F0F1" wp14:editId="695D0F43">
             <wp:extent cx="3868714" cy="4459503"/>
@@ -5429,6 +5666,7 @@
           <w:sz w:val="16"/>
           <w:szCs w:val="16"/>
         </w:rPr>
+        <w:lastRenderedPageBreak/>
         <w:t>2019-09-04 06:00:04 [Information] [</w:t>
       </w:r>
       <w:proofErr w:type="spellStart"/>
@@ -5460,7 +5698,6 @@
           <w:sz w:val="16"/>
           <w:szCs w:val="16"/>
         </w:rPr>
-        <w:lastRenderedPageBreak/>
         <w:t>2019-09-04 06:00:06 [Information] [</w:t>
       </w:r>
       <w:proofErr w:type="spellStart"/>

</xml_diff>

<commit_message>
Merged 2025R4 into CORE-630
</commit_message>
<xml_diff>
--- a/doc/SOFD Core - AD indlaesningsintegration.docx
+++ b/doc/SOFD Core - AD indlaesningsintegration.docx
@@ -152,7 +152,7 @@
         <w:t>1.</w:t>
       </w:r>
       <w:r>
-        <w:t>10</w:t>
+        <w:t>9</w:t>
       </w:r>
       <w:r>
         <w:t>.0</w:t>
@@ -174,9 +174,7 @@
       </w:r>
       <w:r>
         <w:tab/>
-      </w:r>
-      <w:r>
-        <w:t>03</w:t>
+        <w:t>07</w:t>
       </w:r>
       <w:r>
         <w:t>.</w:t>
@@ -185,7 +183,7 @@
         <w:t>0</w:t>
       </w:r>
       <w:r>
-        <w:t>1</w:t>
+        <w:t>3</w:t>
       </w:r>
       <w:r>
         <w:t>.20</w:t>
@@ -194,7 +192,7 @@
         <w:t>2</w:t>
       </w:r>
       <w:r>
-        <w:t>5</w:t>
+        <w:t>2</w:t>
       </w:r>
     </w:p>
     <w:p>
@@ -215,7 +213,7 @@
         <w:tab/>
       </w:r>
       <w:r>
-        <w:t>PSO</w:t>
+        <w:t>BSG</w:t>
       </w:r>
     </w:p>
     <w:p>
@@ -1128,23 +1126,7 @@
                 <w:noProof/>
                 <w:lang w:val="da-DK"/>
               </w:rPr>
-              <w:t>Konfigu</w:t>
-            </w:r>
-            <w:r>
-              <w:rPr>
-                <w:rStyle w:val="Hyperlink"/>
-                <w:noProof/>
-                <w:lang w:val="da-DK"/>
-              </w:rPr>
-              <w:t>r</w:t>
-            </w:r>
-            <w:r>
-              <w:rPr>
-                <w:rStyle w:val="Hyperlink"/>
-                <w:noProof/>
-                <w:lang w:val="da-DK"/>
-              </w:rPr>
-              <w:t>ation af service</w:t>
+              <w:t>Konfiguration af service</w:t>
             </w:r>
             <w:r>
               <w:rPr>
@@ -4674,7 +4656,7 @@
                 <w:sz w:val="16"/>
                 <w:szCs w:val="16"/>
               </w:rPr>
-              <w:t>OU=old</w:t>
+              <w:t>”OU=old</w:t>
             </w:r>
             <w:r>
               <w:rPr>
@@ -4761,7 +4743,7 @@
                 <w:sz w:val="16"/>
                 <w:szCs w:val="16"/>
               </w:rPr>
-              <w:t>=dk</w:t>
+              <w:t>=dk”</w:t>
             </w:r>
           </w:p>
         </w:tc>
@@ -4784,23 +4766,7 @@
                 <w:szCs w:val="16"/>
                 <w:lang w:val="da-DK"/>
               </w:rPr>
-              <w:t xml:space="preserve">En </w:t>
-            </w:r>
-            <w:r>
-              <w:rPr>
-                <w:sz w:val="16"/>
-                <w:szCs w:val="16"/>
-                <w:lang w:val="da-DK"/>
-              </w:rPr>
-              <w:t>semikolon</w:t>
-            </w:r>
-            <w:r>
-              <w:rPr>
-                <w:sz w:val="16"/>
-                <w:szCs w:val="16"/>
-                <w:lang w:val="da-DK"/>
-              </w:rPr>
-              <w:t xml:space="preserve">-separeret liste af enheders distinguished name. Brugere i enhederne, der listes her, bliver ikke synkroniseret.  </w:t>
+              <w:t xml:space="preserve">En ;-separeret liste af enheders distinguished name. Brugere i enhederne, der listes her, bliver ikke synkroniseret.  </w:t>
             </w:r>
           </w:p>
         </w:tc>
@@ -4808,26 +4774,19 @@
       <w:tr>
         <w:tc>
           <w:tcPr>
-            <w:cnfStyle w:val="001000000000" w:firstRow="0" w:lastRow="0" w:firstColumn="1" w:lastColumn="0" w:oddVBand="0" w:evenVBand="0" w:oddHBand="0" w:evenHBand="0" w:firstRowFirstColumn="0" w:firstRowLastColumn="0" w:lastRowFirstColumn="0" w:lastRowLastColumn="0"/>
             <w:tcW w:w="4248" w:type="dxa"/>
           </w:tcPr>
           <w:p>
             <w:pPr>
-              <w:rPr>
-                <w:sz w:val="16"/>
-                <w:szCs w:val="16"/>
-              </w:rPr>
-            </w:pPr>
-            <w:proofErr w:type="spellStart"/>
-            <w:r>
+              <w:cnfStyle w:val="001000000000" w:firstRow="0" w:lastRow="0" w:firstColumn="1" w:lastColumn="0" w:oddVBand="0" w:evenVBand="0" w:oddHBand="0" w:evenHBand="0" w:firstRowFirstColumn="0" w:firstRowLastColumn="0" w:lastRowFirstColumn="0" w:lastRowLastColumn="0"/>
               <w:rPr>
                 <w:b w:val="0"/>
                 <w:bCs w:val="0"/>
                 <w:sz w:val="16"/>
                 <w:szCs w:val="16"/>
               </w:rPr>
-              <w:t>ActiveDirectory.</w:t>
-            </w:r>
+            </w:pPr>
+            <w:proofErr w:type="spellStart"/>
             <w:r>
               <w:rPr>
                 <w:b w:val="0"/>
@@ -4835,16 +4794,7 @@
                 <w:sz w:val="16"/>
                 <w:szCs w:val="16"/>
               </w:rPr>
-              <w:t>In</w:t>
-            </w:r>
-            <w:r>
-              <w:rPr>
-                <w:b w:val="0"/>
-                <w:bCs w:val="0"/>
-                <w:sz w:val="16"/>
-                <w:szCs w:val="16"/>
-              </w:rPr>
-              <w:t>cludeOUs</w:t>
+              <w:t>ActiveDirectory.DisableAccountOrdersAttribute</w:t>
             </w:r>
             <w:proofErr w:type="spellEnd"/>
           </w:p>
@@ -4855,98 +4805,17 @@
           </w:tcPr>
           <w:p>
             <w:pPr>
-              <w:cnfStyle w:val="000000000000" w:firstRow="0" w:lastRow="0" w:firstColumn="0" w:lastColumn="0" w:oddVBand="0" w:evenVBand="0" w:oddHBand="0" w:evenHBand="0" w:firstRowFirstColumn="0" w:firstRowLastColumn="0" w:lastRowFirstColumn="0" w:lastRowLastColumn="0"/>
-              <w:rPr>
-                <w:sz w:val="16"/>
-                <w:szCs w:val="16"/>
-              </w:rPr>
-            </w:pPr>
-            <w:r>
-              <w:rPr>
-                <w:sz w:val="16"/>
-                <w:szCs w:val="16"/>
-              </w:rPr>
-              <w:t xml:space="preserve">OU=old </w:t>
-            </w:r>
-            <w:proofErr w:type="spellStart"/>
-            <w:r>
-              <w:rPr>
-                <w:sz w:val="16"/>
-                <w:szCs w:val="16"/>
-              </w:rPr>
-              <w:t>users,OU</w:t>
-            </w:r>
-            <w:proofErr w:type="spellEnd"/>
-            <w:r>
-              <w:rPr>
-                <w:sz w:val="16"/>
-                <w:szCs w:val="16"/>
-              </w:rPr>
-              <w:t>=</w:t>
-            </w:r>
-            <w:proofErr w:type="spellStart"/>
-            <w:r>
-              <w:rPr>
-                <w:sz w:val="16"/>
-                <w:szCs w:val="16"/>
-              </w:rPr>
-              <w:t>testkøbing,DC</w:t>
-            </w:r>
-            <w:proofErr w:type="spellEnd"/>
-            <w:r>
-              <w:rPr>
-                <w:sz w:val="16"/>
-                <w:szCs w:val="16"/>
-              </w:rPr>
-              <w:t>=</w:t>
-            </w:r>
-            <w:proofErr w:type="spellStart"/>
-            <w:r>
-              <w:rPr>
-                <w:sz w:val="16"/>
-                <w:szCs w:val="16"/>
-              </w:rPr>
-              <w:t>test,DC</w:t>
-            </w:r>
-            <w:proofErr w:type="spellEnd"/>
-            <w:r>
-              <w:rPr>
-                <w:sz w:val="16"/>
-                <w:szCs w:val="16"/>
-              </w:rPr>
-              <w:t>=dk; OU=old users 2,OU=</w:t>
-            </w:r>
-            <w:proofErr w:type="spellStart"/>
-            <w:r>
-              <w:rPr>
-                <w:sz w:val="16"/>
-                <w:szCs w:val="16"/>
-              </w:rPr>
-              <w:t>testkøbing,DC</w:t>
-            </w:r>
-            <w:proofErr w:type="spellEnd"/>
-            <w:r>
-              <w:rPr>
-                <w:sz w:val="16"/>
-                <w:szCs w:val="16"/>
-              </w:rPr>
-              <w:t>=</w:t>
-            </w:r>
-            <w:proofErr w:type="spellStart"/>
-            <w:r>
-              <w:rPr>
-                <w:sz w:val="16"/>
-                <w:szCs w:val="16"/>
-              </w:rPr>
-              <w:t>test,DC</w:t>
-            </w:r>
-            <w:proofErr w:type="spellEnd"/>
-            <w:r>
-              <w:rPr>
-                <w:sz w:val="16"/>
-                <w:szCs w:val="16"/>
-              </w:rPr>
-              <w:t>=dk</w:t>
+              <w:rPr>
+                <w:sz w:val="16"/>
+                <w:szCs w:val="16"/>
+              </w:rPr>
+            </w:pPr>
+            <w:r>
+              <w:rPr>
+                <w:sz w:val="16"/>
+                <w:szCs w:val="16"/>
+              </w:rPr>
+              <w:t>extensionAttribute10</w:t>
             </w:r>
           </w:p>
         </w:tc>
@@ -4956,150 +4825,35 @@
           </w:tcPr>
           <w:p>
             <w:pPr>
-              <w:cnfStyle w:val="000000000000" w:firstRow="0" w:lastRow="0" w:firstColumn="0" w:lastColumn="0" w:oddVBand="0" w:evenVBand="0" w:oddHBand="0" w:evenHBand="0" w:firstRowFirstColumn="0" w:firstRowLastColumn="0" w:lastRowFirstColumn="0" w:lastRowLastColumn="0"/>
-              <w:rPr>
-                <w:sz w:val="16"/>
-                <w:szCs w:val="16"/>
-                <w:lang w:val="da-DK"/>
-              </w:rPr>
-            </w:pPr>
-            <w:r>
-              <w:rPr>
-                <w:sz w:val="16"/>
-                <w:szCs w:val="16"/>
-                <w:lang w:val="da-DK"/>
-              </w:rPr>
-              <w:t xml:space="preserve">En </w:t>
-            </w:r>
-            <w:r>
-              <w:rPr>
-                <w:sz w:val="16"/>
-                <w:szCs w:val="16"/>
-                <w:lang w:val="da-DK"/>
-              </w:rPr>
-              <w:t>semikolon</w:t>
-            </w:r>
-            <w:r>
-              <w:rPr>
-                <w:sz w:val="16"/>
-                <w:szCs w:val="16"/>
-                <w:lang w:val="da-DK"/>
-              </w:rPr>
-              <w:t xml:space="preserve">-separeret liste af enheders distinguished name. </w:t>
-            </w:r>
-            <w:r>
-              <w:rPr>
-                <w:sz w:val="16"/>
-                <w:szCs w:val="16"/>
-                <w:lang w:val="da-DK"/>
-              </w:rPr>
-              <w:br/>
-              <w:t>Såfremt denne liste ikke er tom, er det kun b</w:t>
-            </w:r>
-            <w:r>
-              <w:rPr>
-                <w:sz w:val="16"/>
-                <w:szCs w:val="16"/>
-                <w:lang w:val="da-DK"/>
-              </w:rPr>
-              <w:t xml:space="preserve">rugere </w:t>
-            </w:r>
-            <w:r>
-              <w:rPr>
-                <w:sz w:val="16"/>
-                <w:szCs w:val="16"/>
-                <w:lang w:val="da-DK"/>
-              </w:rPr>
-              <w:t xml:space="preserve">under disse OUer der bliver </w:t>
-            </w:r>
-            <w:r>
-              <w:rPr>
-                <w:sz w:val="16"/>
-                <w:szCs w:val="16"/>
-                <w:lang w:val="da-DK"/>
-              </w:rPr>
-              <w:t>synkroniseret.</w:t>
-            </w:r>
-            <w:r>
-              <w:rPr>
-                <w:sz w:val="16"/>
-                <w:szCs w:val="16"/>
-                <w:lang w:val="da-DK"/>
-              </w:rPr>
-              <w:t xml:space="preserve"> </w:t>
-            </w:r>
-          </w:p>
-        </w:tc>
-      </w:tr>
-      <w:tr>
-        <w:tc>
-          <w:tcPr>
-            <w:cnfStyle w:val="001000000000" w:firstRow="0" w:lastRow="0" w:firstColumn="1" w:lastColumn="0" w:oddVBand="0" w:evenVBand="0" w:oddHBand="0" w:evenHBand="0" w:firstRowFirstColumn="0" w:firstRowLastColumn="0" w:lastRowFirstColumn="0" w:lastRowLastColumn="0"/>
-            <w:tcW w:w="4248" w:type="dxa"/>
-          </w:tcPr>
-          <w:p>
-            <w:pPr>
-              <w:rPr>
-                <w:b w:val="0"/>
-                <w:bCs w:val="0"/>
-                <w:sz w:val="16"/>
-                <w:szCs w:val="16"/>
-              </w:rPr>
-            </w:pPr>
-            <w:proofErr w:type="spellStart"/>
-            <w:r>
-              <w:rPr>
-                <w:b w:val="0"/>
-                <w:bCs w:val="0"/>
-                <w:sz w:val="16"/>
-                <w:szCs w:val="16"/>
-              </w:rPr>
-              <w:t>ActiveDirectory.DisableAccountOrdersAttribute</w:t>
-            </w:r>
-            <w:proofErr w:type="spellEnd"/>
-          </w:p>
-        </w:tc>
-        <w:tc>
-          <w:tcPr>
-            <w:tcW w:w="1984" w:type="dxa"/>
-          </w:tcPr>
-          <w:p>
-            <w:pPr>
-              <w:cnfStyle w:val="000000000000" w:firstRow="0" w:lastRow="0" w:firstColumn="0" w:lastColumn="0" w:oddVBand="0" w:evenVBand="0" w:oddHBand="0" w:evenHBand="0" w:firstRowFirstColumn="0" w:firstRowLastColumn="0" w:lastRowFirstColumn="0" w:lastRowLastColumn="0"/>
-              <w:rPr>
-                <w:sz w:val="16"/>
-                <w:szCs w:val="16"/>
-              </w:rPr>
-            </w:pPr>
-            <w:r>
-              <w:rPr>
-                <w:sz w:val="16"/>
-                <w:szCs w:val="16"/>
-              </w:rPr>
-              <w:t>extensionAttribute10</w:t>
-            </w:r>
-          </w:p>
-        </w:tc>
-        <w:tc>
-          <w:tcPr>
-            <w:tcW w:w="3396" w:type="dxa"/>
-          </w:tcPr>
-          <w:p>
-            <w:pPr>
-              <w:cnfStyle w:val="000000000000" w:firstRow="0" w:lastRow="0" w:firstColumn="0" w:lastColumn="0" w:oddVBand="0" w:evenVBand="0" w:oddHBand="0" w:evenHBand="0" w:firstRowFirstColumn="0" w:firstRowLastColumn="0" w:lastRowFirstColumn="0" w:lastRowLastColumn="0"/>
-              <w:rPr>
-                <w:sz w:val="16"/>
-                <w:szCs w:val="16"/>
-                <w:lang w:val="da-DK"/>
-              </w:rPr>
-            </w:pPr>
-            <w:r>
-              <w:rPr>
-                <w:sz w:val="16"/>
-                <w:szCs w:val="16"/>
-                <w:lang w:val="da-DK"/>
-              </w:rPr>
-              <w:t>Såfremt den angive attribut er udfyldt med ”true” så vil integrationen sætte alle IDM undtagelsesmarkeringer på personen i OS2sofd.</w:t>
+              <w:rPr>
+                <w:sz w:val="16"/>
+                <w:szCs w:val="16"/>
+                <w:lang w:val="da-DK"/>
+              </w:rPr>
+            </w:pPr>
+            <w:r>
+              <w:rPr>
+                <w:sz w:val="16"/>
+                <w:szCs w:val="16"/>
+                <w:lang w:val="da-DK"/>
+              </w:rPr>
+              <w:t xml:space="preserve">Såfremt den angive attribut er udfyldt med ”true” så vil integrationen sætte alle </w:t>
+            </w:r>
+            <w:r>
+              <w:rPr>
+                <w:sz w:val="16"/>
+                <w:szCs w:val="16"/>
+                <w:lang w:val="da-DK"/>
+              </w:rPr>
+              <w:t xml:space="preserve">IDM </w:t>
+            </w:r>
+            <w:r>
+              <w:rPr>
+                <w:sz w:val="16"/>
+                <w:szCs w:val="16"/>
+                <w:lang w:val="da-DK"/>
+              </w:rPr>
+              <w:t>undtagelsesmarkeringer på personen i OS2sofd.</w:t>
             </w:r>
             <w:r>
               <w:rPr>
@@ -5186,6 +4940,7 @@
           <w:tcPr>
             <w:cnfStyle w:val="001000000000" w:firstRow="0" w:lastRow="0" w:firstColumn="1" w:lastColumn="0" w:oddVBand="0" w:evenVBand="0" w:oddHBand="0" w:evenHBand="0" w:firstRowFirstColumn="0" w:firstRowLastColumn="0" w:lastRowFirstColumn="0" w:lastRowLastColumn="0"/>
             <w:tcW w:w="4248" w:type="dxa"/>
+            <w:shd w:val="clear" w:color="auto" w:fill="auto"/>
           </w:tcPr>
           <w:p>
             <w:pPr>
@@ -5212,6 +4967,7 @@
         <w:tc>
           <w:tcPr>
             <w:tcW w:w="1984" w:type="dxa"/>
+            <w:shd w:val="clear" w:color="auto" w:fill="auto"/>
           </w:tcPr>
           <w:p>
             <w:pPr>
@@ -5235,6 +4991,7 @@
         <w:tc>
           <w:tcPr>
             <w:tcW w:w="3396" w:type="dxa"/>
+            <w:shd w:val="clear" w:color="auto" w:fill="auto"/>
           </w:tcPr>
           <w:p>
             <w:pPr>
@@ -5261,6 +5018,7 @@
           <w:tcPr>
             <w:cnfStyle w:val="001000000000" w:firstRow="0" w:lastRow="0" w:firstColumn="1" w:lastColumn="0" w:oddVBand="0" w:evenVBand="0" w:oddHBand="0" w:evenHBand="0" w:firstRowFirstColumn="0" w:firstRowLastColumn="0" w:lastRowFirstColumn="0" w:lastRowLastColumn="0"/>
             <w:tcW w:w="4248" w:type="dxa"/>
+            <w:shd w:val="clear" w:color="auto" w:fill="auto"/>
           </w:tcPr>
           <w:p>
             <w:pPr>
@@ -5287,6 +5045,7 @@
         <w:tc>
           <w:tcPr>
             <w:tcW w:w="1984" w:type="dxa"/>
+            <w:shd w:val="clear" w:color="auto" w:fill="auto"/>
           </w:tcPr>
           <w:p>
             <w:pPr>
@@ -5313,6 +5072,7 @@
         <w:tc>
           <w:tcPr>
             <w:tcW w:w="3396" w:type="dxa"/>
+            <w:shd w:val="clear" w:color="auto" w:fill="auto"/>
           </w:tcPr>
           <w:p>
             <w:pPr>
@@ -5339,6 +5099,7 @@
           <w:tcPr>
             <w:cnfStyle w:val="001000000000" w:firstRow="0" w:lastRow="0" w:firstColumn="1" w:lastColumn="0" w:oddVBand="0" w:evenVBand="0" w:oddHBand="0" w:evenHBand="0" w:firstRowFirstColumn="0" w:firstRowLastColumn="0" w:lastRowFirstColumn="0" w:lastRowLastColumn="0"/>
             <w:tcW w:w="4248" w:type="dxa"/>
+            <w:shd w:val="clear" w:color="auto" w:fill="auto"/>
           </w:tcPr>
           <w:p>
             <w:pPr>
@@ -5365,6 +5126,7 @@
         <w:tc>
           <w:tcPr>
             <w:tcW w:w="1984" w:type="dxa"/>
+            <w:shd w:val="clear" w:color="auto" w:fill="auto"/>
           </w:tcPr>
           <w:p>
             <w:pPr>
@@ -5388,6 +5150,7 @@
         <w:tc>
           <w:tcPr>
             <w:tcW w:w="3396" w:type="dxa"/>
+            <w:shd w:val="clear" w:color="auto" w:fill="auto"/>
           </w:tcPr>
           <w:p>
             <w:pPr>
@@ -5427,40 +5190,40 @@
         <w:rPr>
           <w:lang w:val="da-DK"/>
         </w:rPr>
+        <w:t xml:space="preserve">Såfremt </w:t>
+      </w:r>
+      <w:r>
+        <w:rPr>
+          <w:b/>
+          <w:lang w:val="da-DK"/>
+        </w:rPr>
+        <w:t>ActiveDirectory.IntegratedSecurity</w:t>
+      </w:r>
+      <w:r>
+        <w:rPr>
+          <w:lang w:val="da-DK"/>
+        </w:rPr>
+        <w:t xml:space="preserve"> er sat til “true” I xml-konfigurationen skal se</w:t>
+      </w:r>
+      <w:r>
+        <w:rPr>
+          <w:lang w:val="da-DK"/>
+        </w:rPr>
+        <w:t>rvice kontoen angives på ”Log On” fanen i Windows Services.</w:t>
+      </w:r>
+    </w:p>
+    <w:p>
+      <w:pPr>
+        <w:rPr>
+          <w:lang w:val="da-DK"/>
+        </w:rPr>
+      </w:pPr>
+      <w:r>
+        <w:rPr>
+          <w:noProof/>
+          <w:lang w:val="da-DK"/>
+        </w:rPr>
         <w:lastRenderedPageBreak/>
-        <w:t xml:space="preserve">Såfremt </w:t>
-      </w:r>
-      <w:r>
-        <w:rPr>
-          <w:b/>
-          <w:lang w:val="da-DK"/>
-        </w:rPr>
-        <w:t>ActiveDirectory.IntegratedSecurity</w:t>
-      </w:r>
-      <w:r>
-        <w:rPr>
-          <w:lang w:val="da-DK"/>
-        </w:rPr>
-        <w:t xml:space="preserve"> er sat til “true” I xml-konfigurationen skal se</w:t>
-      </w:r>
-      <w:r>
-        <w:rPr>
-          <w:lang w:val="da-DK"/>
-        </w:rPr>
-        <w:t>rvice kontoen angives på ”Log On” fanen i Windows Services.</w:t>
-      </w:r>
-    </w:p>
-    <w:p>
-      <w:pPr>
-        <w:rPr>
-          <w:lang w:val="da-DK"/>
-        </w:rPr>
-      </w:pPr>
-      <w:r>
-        <w:rPr>
-          <w:noProof/>
-          <w:lang w:val="da-DK"/>
-        </w:rPr>
         <w:drawing>
           <wp:inline distT="0" distB="0" distL="0" distR="0" wp14:anchorId="25B9F0F1" wp14:editId="695D0F43">
             <wp:extent cx="3868714" cy="4459503"/>
@@ -5666,7 +5429,6 @@
           <w:sz w:val="16"/>
           <w:szCs w:val="16"/>
         </w:rPr>
-        <w:lastRenderedPageBreak/>
         <w:t>2019-09-04 06:00:04 [Information] [</w:t>
       </w:r>
       <w:proofErr w:type="spellStart"/>
@@ -5698,6 +5460,7 @@
           <w:sz w:val="16"/>
           <w:szCs w:val="16"/>
         </w:rPr>
+        <w:lastRenderedPageBreak/>
         <w:t>2019-09-04 06:00:06 [Information] [</w:t>
       </w:r>
       <w:proofErr w:type="spellStart"/>

</xml_diff>

<commit_message>
added generateUsername api endpoint
</commit_message>
<xml_diff>
--- a/doc/SOFD Core - AD indlaesningsintegration.docx
+++ b/doc/SOFD Core - AD indlaesningsintegration.docx
@@ -152,7 +152,7 @@
         <w:t>1.</w:t>
       </w:r>
       <w:r>
-        <w:t>9</w:t>
+        <w:t>10</w:t>
       </w:r>
       <w:r>
         <w:t>.0</w:t>
@@ -174,7 +174,9 @@
       </w:r>
       <w:r>
         <w:tab/>
-        <w:t>07</w:t>
+      </w:r>
+      <w:r>
+        <w:t>03</w:t>
       </w:r>
       <w:r>
         <w:t>.</w:t>
@@ -183,7 +185,7 @@
         <w:t>0</w:t>
       </w:r>
       <w:r>
-        <w:t>3</w:t>
+        <w:t>1</w:t>
       </w:r>
       <w:r>
         <w:t>.20</w:t>
@@ -192,7 +194,7 @@
         <w:t>2</w:t>
       </w:r>
       <w:r>
-        <w:t>2</w:t>
+        <w:t>5</w:t>
       </w:r>
     </w:p>
     <w:p>
@@ -213,7 +215,7 @@
         <w:tab/>
       </w:r>
       <w:r>
-        <w:t>BSG</w:t>
+        <w:t>PSO</w:t>
       </w:r>
     </w:p>
     <w:p>
@@ -1126,7 +1128,23 @@
                 <w:noProof/>
                 <w:lang w:val="da-DK"/>
               </w:rPr>
-              <w:t>Konfiguration af service</w:t>
+              <w:t>Konfigu</w:t>
+            </w:r>
+            <w:r>
+              <w:rPr>
+                <w:rStyle w:val="Hyperlink"/>
+                <w:noProof/>
+                <w:lang w:val="da-DK"/>
+              </w:rPr>
+              <w:t>r</w:t>
+            </w:r>
+            <w:r>
+              <w:rPr>
+                <w:rStyle w:val="Hyperlink"/>
+                <w:noProof/>
+                <w:lang w:val="da-DK"/>
+              </w:rPr>
+              <w:t>ation af service</w:t>
             </w:r>
             <w:r>
               <w:rPr>
@@ -4656,7 +4674,7 @@
                 <w:sz w:val="16"/>
                 <w:szCs w:val="16"/>
               </w:rPr>
-              <w:t>”OU=old</w:t>
+              <w:t>OU=old</w:t>
             </w:r>
             <w:r>
               <w:rPr>
@@ -4743,7 +4761,7 @@
                 <w:sz w:val="16"/>
                 <w:szCs w:val="16"/>
               </w:rPr>
-              <w:t>=dk”</w:t>
+              <w:t>=dk</w:t>
             </w:r>
           </w:p>
         </w:tc>
@@ -4766,7 +4784,23 @@
                 <w:szCs w:val="16"/>
                 <w:lang w:val="da-DK"/>
               </w:rPr>
-              <w:t xml:space="preserve">En ;-separeret liste af enheders distinguished name. Brugere i enhederne, der listes her, bliver ikke synkroniseret.  </w:t>
+              <w:t xml:space="preserve">En </w:t>
+            </w:r>
+            <w:r>
+              <w:rPr>
+                <w:sz w:val="16"/>
+                <w:szCs w:val="16"/>
+                <w:lang w:val="da-DK"/>
+              </w:rPr>
+              <w:t>semikolon</w:t>
+            </w:r>
+            <w:r>
+              <w:rPr>
+                <w:sz w:val="16"/>
+                <w:szCs w:val="16"/>
+                <w:lang w:val="da-DK"/>
+              </w:rPr>
+              <w:t xml:space="preserve">-separeret liste af enheders distinguished name. Brugere i enhederne, der listes her, bliver ikke synkroniseret.  </w:t>
             </w:r>
           </w:p>
         </w:tc>
@@ -4774,19 +4808,26 @@
       <w:tr>
         <w:tc>
           <w:tcPr>
+            <w:cnfStyle w:val="001000000000" w:firstRow="0" w:lastRow="0" w:firstColumn="1" w:lastColumn="0" w:oddVBand="0" w:evenVBand="0" w:oddHBand="0" w:evenHBand="0" w:firstRowFirstColumn="0" w:firstRowLastColumn="0" w:lastRowFirstColumn="0" w:lastRowLastColumn="0"/>
             <w:tcW w:w="4248" w:type="dxa"/>
           </w:tcPr>
           <w:p>
             <w:pPr>
-              <w:cnfStyle w:val="001000000000" w:firstRow="0" w:lastRow="0" w:firstColumn="1" w:lastColumn="0" w:oddVBand="0" w:evenVBand="0" w:oddHBand="0" w:evenHBand="0" w:firstRowFirstColumn="0" w:firstRowLastColumn="0" w:lastRowFirstColumn="0" w:lastRowLastColumn="0"/>
+              <w:rPr>
+                <w:sz w:val="16"/>
+                <w:szCs w:val="16"/>
+              </w:rPr>
+            </w:pPr>
+            <w:proofErr w:type="spellStart"/>
+            <w:r>
               <w:rPr>
                 <w:b w:val="0"/>
                 <w:bCs w:val="0"/>
                 <w:sz w:val="16"/>
                 <w:szCs w:val="16"/>
               </w:rPr>
-            </w:pPr>
-            <w:proofErr w:type="spellStart"/>
+              <w:t>ActiveDirectory.</w:t>
+            </w:r>
             <w:r>
               <w:rPr>
                 <w:b w:val="0"/>
@@ -4794,6 +4835,225 @@
                 <w:sz w:val="16"/>
                 <w:szCs w:val="16"/>
               </w:rPr>
+              <w:t>In</w:t>
+            </w:r>
+            <w:r>
+              <w:rPr>
+                <w:b w:val="0"/>
+                <w:bCs w:val="0"/>
+                <w:sz w:val="16"/>
+                <w:szCs w:val="16"/>
+              </w:rPr>
+              <w:t>cludeOUs</w:t>
+            </w:r>
+            <w:proofErr w:type="spellEnd"/>
+          </w:p>
+        </w:tc>
+        <w:tc>
+          <w:tcPr>
+            <w:tcW w:w="1984" w:type="dxa"/>
+          </w:tcPr>
+          <w:p>
+            <w:pPr>
+              <w:cnfStyle w:val="000000000000" w:firstRow="0" w:lastRow="0" w:firstColumn="0" w:lastColumn="0" w:oddVBand="0" w:evenVBand="0" w:oddHBand="0" w:evenHBand="0" w:firstRowFirstColumn="0" w:firstRowLastColumn="0" w:lastRowFirstColumn="0" w:lastRowLastColumn="0"/>
+              <w:rPr>
+                <w:sz w:val="16"/>
+                <w:szCs w:val="16"/>
+              </w:rPr>
+            </w:pPr>
+            <w:r>
+              <w:rPr>
+                <w:sz w:val="16"/>
+                <w:szCs w:val="16"/>
+              </w:rPr>
+              <w:t xml:space="preserve">OU=old </w:t>
+            </w:r>
+            <w:proofErr w:type="spellStart"/>
+            <w:r>
+              <w:rPr>
+                <w:sz w:val="16"/>
+                <w:szCs w:val="16"/>
+              </w:rPr>
+              <w:t>users,OU</w:t>
+            </w:r>
+            <w:proofErr w:type="spellEnd"/>
+            <w:r>
+              <w:rPr>
+                <w:sz w:val="16"/>
+                <w:szCs w:val="16"/>
+              </w:rPr>
+              <w:t>=</w:t>
+            </w:r>
+            <w:proofErr w:type="spellStart"/>
+            <w:r>
+              <w:rPr>
+                <w:sz w:val="16"/>
+                <w:szCs w:val="16"/>
+              </w:rPr>
+              <w:t>testkøbing,DC</w:t>
+            </w:r>
+            <w:proofErr w:type="spellEnd"/>
+            <w:r>
+              <w:rPr>
+                <w:sz w:val="16"/>
+                <w:szCs w:val="16"/>
+              </w:rPr>
+              <w:t>=</w:t>
+            </w:r>
+            <w:proofErr w:type="spellStart"/>
+            <w:r>
+              <w:rPr>
+                <w:sz w:val="16"/>
+                <w:szCs w:val="16"/>
+              </w:rPr>
+              <w:t>test,DC</w:t>
+            </w:r>
+            <w:proofErr w:type="spellEnd"/>
+            <w:r>
+              <w:rPr>
+                <w:sz w:val="16"/>
+                <w:szCs w:val="16"/>
+              </w:rPr>
+              <w:t>=dk; OU=old users 2,OU=</w:t>
+            </w:r>
+            <w:proofErr w:type="spellStart"/>
+            <w:r>
+              <w:rPr>
+                <w:sz w:val="16"/>
+                <w:szCs w:val="16"/>
+              </w:rPr>
+              <w:t>testkøbing,DC</w:t>
+            </w:r>
+            <w:proofErr w:type="spellEnd"/>
+            <w:r>
+              <w:rPr>
+                <w:sz w:val="16"/>
+                <w:szCs w:val="16"/>
+              </w:rPr>
+              <w:t>=</w:t>
+            </w:r>
+            <w:proofErr w:type="spellStart"/>
+            <w:r>
+              <w:rPr>
+                <w:sz w:val="16"/>
+                <w:szCs w:val="16"/>
+              </w:rPr>
+              <w:t>test,DC</w:t>
+            </w:r>
+            <w:proofErr w:type="spellEnd"/>
+            <w:r>
+              <w:rPr>
+                <w:sz w:val="16"/>
+                <w:szCs w:val="16"/>
+              </w:rPr>
+              <w:t>=dk</w:t>
+            </w:r>
+          </w:p>
+        </w:tc>
+        <w:tc>
+          <w:tcPr>
+            <w:tcW w:w="3396" w:type="dxa"/>
+          </w:tcPr>
+          <w:p>
+            <w:pPr>
+              <w:cnfStyle w:val="000000000000" w:firstRow="0" w:lastRow="0" w:firstColumn="0" w:lastColumn="0" w:oddVBand="0" w:evenVBand="0" w:oddHBand="0" w:evenHBand="0" w:firstRowFirstColumn="0" w:firstRowLastColumn="0" w:lastRowFirstColumn="0" w:lastRowLastColumn="0"/>
+              <w:rPr>
+                <w:sz w:val="16"/>
+                <w:szCs w:val="16"/>
+                <w:lang w:val="da-DK"/>
+              </w:rPr>
+            </w:pPr>
+            <w:r>
+              <w:rPr>
+                <w:sz w:val="16"/>
+                <w:szCs w:val="16"/>
+                <w:lang w:val="da-DK"/>
+              </w:rPr>
+              <w:t xml:space="preserve">En </w:t>
+            </w:r>
+            <w:r>
+              <w:rPr>
+                <w:sz w:val="16"/>
+                <w:szCs w:val="16"/>
+                <w:lang w:val="da-DK"/>
+              </w:rPr>
+              <w:t>semikolon</w:t>
+            </w:r>
+            <w:r>
+              <w:rPr>
+                <w:sz w:val="16"/>
+                <w:szCs w:val="16"/>
+                <w:lang w:val="da-DK"/>
+              </w:rPr>
+              <w:t xml:space="preserve">-separeret liste af enheders distinguished name. </w:t>
+            </w:r>
+            <w:r>
+              <w:rPr>
+                <w:sz w:val="16"/>
+                <w:szCs w:val="16"/>
+                <w:lang w:val="da-DK"/>
+              </w:rPr>
+              <w:br/>
+              <w:t>Såfremt denne liste ikke er tom, er det kun b</w:t>
+            </w:r>
+            <w:r>
+              <w:rPr>
+                <w:sz w:val="16"/>
+                <w:szCs w:val="16"/>
+                <w:lang w:val="da-DK"/>
+              </w:rPr>
+              <w:t xml:space="preserve">rugere </w:t>
+            </w:r>
+            <w:r>
+              <w:rPr>
+                <w:sz w:val="16"/>
+                <w:szCs w:val="16"/>
+                <w:lang w:val="da-DK"/>
+              </w:rPr>
+              <w:t xml:space="preserve">under disse OUer der bliver </w:t>
+            </w:r>
+            <w:r>
+              <w:rPr>
+                <w:sz w:val="16"/>
+                <w:szCs w:val="16"/>
+                <w:lang w:val="da-DK"/>
+              </w:rPr>
+              <w:t>synkroniseret.</w:t>
+            </w:r>
+            <w:r>
+              <w:rPr>
+                <w:sz w:val="16"/>
+                <w:szCs w:val="16"/>
+                <w:lang w:val="da-DK"/>
+              </w:rPr>
+              <w:t xml:space="preserve"> </w:t>
+            </w:r>
+          </w:p>
+        </w:tc>
+      </w:tr>
+      <w:tr>
+        <w:tc>
+          <w:tcPr>
+            <w:cnfStyle w:val="001000000000" w:firstRow="0" w:lastRow="0" w:firstColumn="1" w:lastColumn="0" w:oddVBand="0" w:evenVBand="0" w:oddHBand="0" w:evenHBand="0" w:firstRowFirstColumn="0" w:firstRowLastColumn="0" w:lastRowFirstColumn="0" w:lastRowLastColumn="0"/>
+            <w:tcW w:w="4248" w:type="dxa"/>
+          </w:tcPr>
+          <w:p>
+            <w:pPr>
+              <w:rPr>
+                <w:b w:val="0"/>
+                <w:bCs w:val="0"/>
+                <w:sz w:val="16"/>
+                <w:szCs w:val="16"/>
+              </w:rPr>
+            </w:pPr>
+            <w:proofErr w:type="spellStart"/>
+            <w:r>
+              <w:rPr>
+                <w:b w:val="0"/>
+                <w:bCs w:val="0"/>
+                <w:sz w:val="16"/>
+                <w:szCs w:val="16"/>
+              </w:rPr>
               <w:t>ActiveDirectory.DisableAccountOrdersAttribute</w:t>
             </w:r>
             <w:proofErr w:type="spellEnd"/>
@@ -4805,6 +5065,7 @@
           </w:tcPr>
           <w:p>
             <w:pPr>
+              <w:cnfStyle w:val="000000000000" w:firstRow="0" w:lastRow="0" w:firstColumn="0" w:lastColumn="0" w:oddVBand="0" w:evenVBand="0" w:oddHBand="0" w:evenHBand="0" w:firstRowFirstColumn="0" w:firstRowLastColumn="0" w:lastRowFirstColumn="0" w:lastRowLastColumn="0"/>
               <w:rPr>
                 <w:sz w:val="16"/>
                 <w:szCs w:val="16"/>
@@ -4825,35 +5086,20 @@
           </w:tcPr>
           <w:p>
             <w:pPr>
-              <w:rPr>
-                <w:sz w:val="16"/>
-                <w:szCs w:val="16"/>
-                <w:lang w:val="da-DK"/>
-              </w:rPr>
-            </w:pPr>
-            <w:r>
-              <w:rPr>
-                <w:sz w:val="16"/>
-                <w:szCs w:val="16"/>
-                <w:lang w:val="da-DK"/>
-              </w:rPr>
-              <w:t xml:space="preserve">Såfremt den angive attribut er udfyldt med ”true” så vil integrationen sætte alle </w:t>
-            </w:r>
-            <w:r>
-              <w:rPr>
-                <w:sz w:val="16"/>
-                <w:szCs w:val="16"/>
-                <w:lang w:val="da-DK"/>
-              </w:rPr>
-              <w:t xml:space="preserve">IDM </w:t>
-            </w:r>
-            <w:r>
-              <w:rPr>
-                <w:sz w:val="16"/>
-                <w:szCs w:val="16"/>
-                <w:lang w:val="da-DK"/>
-              </w:rPr>
-              <w:t>undtagelsesmarkeringer på personen i OS2sofd.</w:t>
+              <w:cnfStyle w:val="000000000000" w:firstRow="0" w:lastRow="0" w:firstColumn="0" w:lastColumn="0" w:oddVBand="0" w:evenVBand="0" w:oddHBand="0" w:evenHBand="0" w:firstRowFirstColumn="0" w:firstRowLastColumn="0" w:lastRowFirstColumn="0" w:lastRowLastColumn="0"/>
+              <w:rPr>
+                <w:sz w:val="16"/>
+                <w:szCs w:val="16"/>
+                <w:lang w:val="da-DK"/>
+              </w:rPr>
+            </w:pPr>
+            <w:r>
+              <w:rPr>
+                <w:sz w:val="16"/>
+                <w:szCs w:val="16"/>
+                <w:lang w:val="da-DK"/>
+              </w:rPr>
+              <w:t>Såfremt den angive attribut er udfyldt med ”true” så vil integrationen sætte alle IDM undtagelsesmarkeringer på personen i OS2sofd.</w:t>
             </w:r>
             <w:r>
               <w:rPr>
@@ -4940,7 +5186,6 @@
           <w:tcPr>
             <w:cnfStyle w:val="001000000000" w:firstRow="0" w:lastRow="0" w:firstColumn="1" w:lastColumn="0" w:oddVBand="0" w:evenVBand="0" w:oddHBand="0" w:evenHBand="0" w:firstRowFirstColumn="0" w:firstRowLastColumn="0" w:lastRowFirstColumn="0" w:lastRowLastColumn="0"/>
             <w:tcW w:w="4248" w:type="dxa"/>
-            <w:shd w:val="clear" w:color="auto" w:fill="auto"/>
           </w:tcPr>
           <w:p>
             <w:pPr>
@@ -4967,7 +5212,6 @@
         <w:tc>
           <w:tcPr>
             <w:tcW w:w="1984" w:type="dxa"/>
-            <w:shd w:val="clear" w:color="auto" w:fill="auto"/>
           </w:tcPr>
           <w:p>
             <w:pPr>
@@ -4991,7 +5235,6 @@
         <w:tc>
           <w:tcPr>
             <w:tcW w:w="3396" w:type="dxa"/>
-            <w:shd w:val="clear" w:color="auto" w:fill="auto"/>
           </w:tcPr>
           <w:p>
             <w:pPr>
@@ -5018,7 +5261,6 @@
           <w:tcPr>
             <w:cnfStyle w:val="001000000000" w:firstRow="0" w:lastRow="0" w:firstColumn="1" w:lastColumn="0" w:oddVBand="0" w:evenVBand="0" w:oddHBand="0" w:evenHBand="0" w:firstRowFirstColumn="0" w:firstRowLastColumn="0" w:lastRowFirstColumn="0" w:lastRowLastColumn="0"/>
             <w:tcW w:w="4248" w:type="dxa"/>
-            <w:shd w:val="clear" w:color="auto" w:fill="auto"/>
           </w:tcPr>
           <w:p>
             <w:pPr>
@@ -5045,7 +5287,6 @@
         <w:tc>
           <w:tcPr>
             <w:tcW w:w="1984" w:type="dxa"/>
-            <w:shd w:val="clear" w:color="auto" w:fill="auto"/>
           </w:tcPr>
           <w:p>
             <w:pPr>
@@ -5072,7 +5313,6 @@
         <w:tc>
           <w:tcPr>
             <w:tcW w:w="3396" w:type="dxa"/>
-            <w:shd w:val="clear" w:color="auto" w:fill="auto"/>
           </w:tcPr>
           <w:p>
             <w:pPr>
@@ -5099,7 +5339,6 @@
           <w:tcPr>
             <w:cnfStyle w:val="001000000000" w:firstRow="0" w:lastRow="0" w:firstColumn="1" w:lastColumn="0" w:oddVBand="0" w:evenVBand="0" w:oddHBand="0" w:evenHBand="0" w:firstRowFirstColumn="0" w:firstRowLastColumn="0" w:lastRowFirstColumn="0" w:lastRowLastColumn="0"/>
             <w:tcW w:w="4248" w:type="dxa"/>
-            <w:shd w:val="clear" w:color="auto" w:fill="auto"/>
           </w:tcPr>
           <w:p>
             <w:pPr>
@@ -5126,7 +5365,6 @@
         <w:tc>
           <w:tcPr>
             <w:tcW w:w="1984" w:type="dxa"/>
-            <w:shd w:val="clear" w:color="auto" w:fill="auto"/>
           </w:tcPr>
           <w:p>
             <w:pPr>
@@ -5150,7 +5388,6 @@
         <w:tc>
           <w:tcPr>
             <w:tcW w:w="3396" w:type="dxa"/>
-            <w:shd w:val="clear" w:color="auto" w:fill="auto"/>
           </w:tcPr>
           <w:p>
             <w:pPr>
@@ -5190,6 +5427,7 @@
         <w:rPr>
           <w:lang w:val="da-DK"/>
         </w:rPr>
+        <w:lastRenderedPageBreak/>
         <w:t xml:space="preserve">Såfremt </w:t>
       </w:r>
       <w:r>
@@ -5223,7 +5461,6 @@
           <w:noProof/>
           <w:lang w:val="da-DK"/>
         </w:rPr>
-        <w:lastRenderedPageBreak/>
         <w:drawing>
           <wp:inline distT="0" distB="0" distL="0" distR="0" wp14:anchorId="25B9F0F1" wp14:editId="695D0F43">
             <wp:extent cx="3868714" cy="4459503"/>
@@ -5429,6 +5666,7 @@
           <w:sz w:val="16"/>
           <w:szCs w:val="16"/>
         </w:rPr>
+        <w:lastRenderedPageBreak/>
         <w:t>2019-09-04 06:00:04 [Information] [</w:t>
       </w:r>
       <w:proofErr w:type="spellStart"/>
@@ -5460,7 +5698,6 @@
           <w:sz w:val="16"/>
           <w:szCs w:val="16"/>
         </w:rPr>
-        <w:lastRenderedPageBreak/>
         <w:t>2019-09-04 06:00:06 [Information] [</w:t>
       </w:r>
       <w:proofErr w:type="spellStart"/>

</xml_diff>

<commit_message>
fixed ui errors when editing phones
</commit_message>
<xml_diff>
--- a/doc/SOFD Core - AD indlaesningsintegration.docx
+++ b/doc/SOFD Core - AD indlaesningsintegration.docx
@@ -152,7 +152,7 @@
         <w:t>1.</w:t>
       </w:r>
       <w:r>
-        <w:t>9</w:t>
+        <w:t>10</w:t>
       </w:r>
       <w:r>
         <w:t>.0</w:t>
@@ -174,7 +174,9 @@
       </w:r>
       <w:r>
         <w:tab/>
-        <w:t>07</w:t>
+      </w:r>
+      <w:r>
+        <w:t>03</w:t>
       </w:r>
       <w:r>
         <w:t>.</w:t>
@@ -183,7 +185,7 @@
         <w:t>0</w:t>
       </w:r>
       <w:r>
-        <w:t>3</w:t>
+        <w:t>1</w:t>
       </w:r>
       <w:r>
         <w:t>.20</w:t>
@@ -192,7 +194,7 @@
         <w:t>2</w:t>
       </w:r>
       <w:r>
-        <w:t>2</w:t>
+        <w:t>5</w:t>
       </w:r>
     </w:p>
     <w:p>
@@ -213,7 +215,7 @@
         <w:tab/>
       </w:r>
       <w:r>
-        <w:t>BSG</w:t>
+        <w:t>PSO</w:t>
       </w:r>
     </w:p>
     <w:p>
@@ -1126,7 +1128,23 @@
                 <w:noProof/>
                 <w:lang w:val="da-DK"/>
               </w:rPr>
-              <w:t>Konfiguration af service</w:t>
+              <w:t>Konfigu</w:t>
+            </w:r>
+            <w:r>
+              <w:rPr>
+                <w:rStyle w:val="Hyperlink"/>
+                <w:noProof/>
+                <w:lang w:val="da-DK"/>
+              </w:rPr>
+              <w:t>r</w:t>
+            </w:r>
+            <w:r>
+              <w:rPr>
+                <w:rStyle w:val="Hyperlink"/>
+                <w:noProof/>
+                <w:lang w:val="da-DK"/>
+              </w:rPr>
+              <w:t>ation af service</w:t>
             </w:r>
             <w:r>
               <w:rPr>
@@ -4656,7 +4674,7 @@
                 <w:sz w:val="16"/>
                 <w:szCs w:val="16"/>
               </w:rPr>
-              <w:t>”OU=old</w:t>
+              <w:t>OU=old</w:t>
             </w:r>
             <w:r>
               <w:rPr>
@@ -4743,7 +4761,7 @@
                 <w:sz w:val="16"/>
                 <w:szCs w:val="16"/>
               </w:rPr>
-              <w:t>=dk”</w:t>
+              <w:t>=dk</w:t>
             </w:r>
           </w:p>
         </w:tc>
@@ -4766,7 +4784,23 @@
                 <w:szCs w:val="16"/>
                 <w:lang w:val="da-DK"/>
               </w:rPr>
-              <w:t xml:space="preserve">En ;-separeret liste af enheders distinguished name. Brugere i enhederne, der listes her, bliver ikke synkroniseret.  </w:t>
+              <w:t xml:space="preserve">En </w:t>
+            </w:r>
+            <w:r>
+              <w:rPr>
+                <w:sz w:val="16"/>
+                <w:szCs w:val="16"/>
+                <w:lang w:val="da-DK"/>
+              </w:rPr>
+              <w:t>semikolon</w:t>
+            </w:r>
+            <w:r>
+              <w:rPr>
+                <w:sz w:val="16"/>
+                <w:szCs w:val="16"/>
+                <w:lang w:val="da-DK"/>
+              </w:rPr>
+              <w:t xml:space="preserve">-separeret liste af enheders distinguished name. Brugere i enhederne, der listes her, bliver ikke synkroniseret.  </w:t>
             </w:r>
           </w:p>
         </w:tc>
@@ -4774,19 +4808,26 @@
       <w:tr>
         <w:tc>
           <w:tcPr>
+            <w:cnfStyle w:val="001000000000" w:firstRow="0" w:lastRow="0" w:firstColumn="1" w:lastColumn="0" w:oddVBand="0" w:evenVBand="0" w:oddHBand="0" w:evenHBand="0" w:firstRowFirstColumn="0" w:firstRowLastColumn="0" w:lastRowFirstColumn="0" w:lastRowLastColumn="0"/>
             <w:tcW w:w="4248" w:type="dxa"/>
           </w:tcPr>
           <w:p>
             <w:pPr>
-              <w:cnfStyle w:val="001000000000" w:firstRow="0" w:lastRow="0" w:firstColumn="1" w:lastColumn="0" w:oddVBand="0" w:evenVBand="0" w:oddHBand="0" w:evenHBand="0" w:firstRowFirstColumn="0" w:firstRowLastColumn="0" w:lastRowFirstColumn="0" w:lastRowLastColumn="0"/>
+              <w:rPr>
+                <w:sz w:val="16"/>
+                <w:szCs w:val="16"/>
+              </w:rPr>
+            </w:pPr>
+            <w:proofErr w:type="spellStart"/>
+            <w:r>
               <w:rPr>
                 <w:b w:val="0"/>
                 <w:bCs w:val="0"/>
                 <w:sz w:val="16"/>
                 <w:szCs w:val="16"/>
               </w:rPr>
-            </w:pPr>
-            <w:proofErr w:type="spellStart"/>
+              <w:t>ActiveDirectory.</w:t>
+            </w:r>
             <w:r>
               <w:rPr>
                 <w:b w:val="0"/>
@@ -4794,6 +4835,225 @@
                 <w:sz w:val="16"/>
                 <w:szCs w:val="16"/>
               </w:rPr>
+              <w:t>In</w:t>
+            </w:r>
+            <w:r>
+              <w:rPr>
+                <w:b w:val="0"/>
+                <w:bCs w:val="0"/>
+                <w:sz w:val="16"/>
+                <w:szCs w:val="16"/>
+              </w:rPr>
+              <w:t>cludeOUs</w:t>
+            </w:r>
+            <w:proofErr w:type="spellEnd"/>
+          </w:p>
+        </w:tc>
+        <w:tc>
+          <w:tcPr>
+            <w:tcW w:w="1984" w:type="dxa"/>
+          </w:tcPr>
+          <w:p>
+            <w:pPr>
+              <w:cnfStyle w:val="000000000000" w:firstRow="0" w:lastRow="0" w:firstColumn="0" w:lastColumn="0" w:oddVBand="0" w:evenVBand="0" w:oddHBand="0" w:evenHBand="0" w:firstRowFirstColumn="0" w:firstRowLastColumn="0" w:lastRowFirstColumn="0" w:lastRowLastColumn="0"/>
+              <w:rPr>
+                <w:sz w:val="16"/>
+                <w:szCs w:val="16"/>
+              </w:rPr>
+            </w:pPr>
+            <w:r>
+              <w:rPr>
+                <w:sz w:val="16"/>
+                <w:szCs w:val="16"/>
+              </w:rPr>
+              <w:t xml:space="preserve">OU=old </w:t>
+            </w:r>
+            <w:proofErr w:type="spellStart"/>
+            <w:r>
+              <w:rPr>
+                <w:sz w:val="16"/>
+                <w:szCs w:val="16"/>
+              </w:rPr>
+              <w:t>users,OU</w:t>
+            </w:r>
+            <w:proofErr w:type="spellEnd"/>
+            <w:r>
+              <w:rPr>
+                <w:sz w:val="16"/>
+                <w:szCs w:val="16"/>
+              </w:rPr>
+              <w:t>=</w:t>
+            </w:r>
+            <w:proofErr w:type="spellStart"/>
+            <w:r>
+              <w:rPr>
+                <w:sz w:val="16"/>
+                <w:szCs w:val="16"/>
+              </w:rPr>
+              <w:t>testkøbing,DC</w:t>
+            </w:r>
+            <w:proofErr w:type="spellEnd"/>
+            <w:r>
+              <w:rPr>
+                <w:sz w:val="16"/>
+                <w:szCs w:val="16"/>
+              </w:rPr>
+              <w:t>=</w:t>
+            </w:r>
+            <w:proofErr w:type="spellStart"/>
+            <w:r>
+              <w:rPr>
+                <w:sz w:val="16"/>
+                <w:szCs w:val="16"/>
+              </w:rPr>
+              <w:t>test,DC</w:t>
+            </w:r>
+            <w:proofErr w:type="spellEnd"/>
+            <w:r>
+              <w:rPr>
+                <w:sz w:val="16"/>
+                <w:szCs w:val="16"/>
+              </w:rPr>
+              <w:t>=dk; OU=old users 2,OU=</w:t>
+            </w:r>
+            <w:proofErr w:type="spellStart"/>
+            <w:r>
+              <w:rPr>
+                <w:sz w:val="16"/>
+                <w:szCs w:val="16"/>
+              </w:rPr>
+              <w:t>testkøbing,DC</w:t>
+            </w:r>
+            <w:proofErr w:type="spellEnd"/>
+            <w:r>
+              <w:rPr>
+                <w:sz w:val="16"/>
+                <w:szCs w:val="16"/>
+              </w:rPr>
+              <w:t>=</w:t>
+            </w:r>
+            <w:proofErr w:type="spellStart"/>
+            <w:r>
+              <w:rPr>
+                <w:sz w:val="16"/>
+                <w:szCs w:val="16"/>
+              </w:rPr>
+              <w:t>test,DC</w:t>
+            </w:r>
+            <w:proofErr w:type="spellEnd"/>
+            <w:r>
+              <w:rPr>
+                <w:sz w:val="16"/>
+                <w:szCs w:val="16"/>
+              </w:rPr>
+              <w:t>=dk</w:t>
+            </w:r>
+          </w:p>
+        </w:tc>
+        <w:tc>
+          <w:tcPr>
+            <w:tcW w:w="3396" w:type="dxa"/>
+          </w:tcPr>
+          <w:p>
+            <w:pPr>
+              <w:cnfStyle w:val="000000000000" w:firstRow="0" w:lastRow="0" w:firstColumn="0" w:lastColumn="0" w:oddVBand="0" w:evenVBand="0" w:oddHBand="0" w:evenHBand="0" w:firstRowFirstColumn="0" w:firstRowLastColumn="0" w:lastRowFirstColumn="0" w:lastRowLastColumn="0"/>
+              <w:rPr>
+                <w:sz w:val="16"/>
+                <w:szCs w:val="16"/>
+                <w:lang w:val="da-DK"/>
+              </w:rPr>
+            </w:pPr>
+            <w:r>
+              <w:rPr>
+                <w:sz w:val="16"/>
+                <w:szCs w:val="16"/>
+                <w:lang w:val="da-DK"/>
+              </w:rPr>
+              <w:t xml:space="preserve">En </w:t>
+            </w:r>
+            <w:r>
+              <w:rPr>
+                <w:sz w:val="16"/>
+                <w:szCs w:val="16"/>
+                <w:lang w:val="da-DK"/>
+              </w:rPr>
+              <w:t>semikolon</w:t>
+            </w:r>
+            <w:r>
+              <w:rPr>
+                <w:sz w:val="16"/>
+                <w:szCs w:val="16"/>
+                <w:lang w:val="da-DK"/>
+              </w:rPr>
+              <w:t xml:space="preserve">-separeret liste af enheders distinguished name. </w:t>
+            </w:r>
+            <w:r>
+              <w:rPr>
+                <w:sz w:val="16"/>
+                <w:szCs w:val="16"/>
+                <w:lang w:val="da-DK"/>
+              </w:rPr>
+              <w:br/>
+              <w:t>Såfremt denne liste ikke er tom, er det kun b</w:t>
+            </w:r>
+            <w:r>
+              <w:rPr>
+                <w:sz w:val="16"/>
+                <w:szCs w:val="16"/>
+                <w:lang w:val="da-DK"/>
+              </w:rPr>
+              <w:t xml:space="preserve">rugere </w:t>
+            </w:r>
+            <w:r>
+              <w:rPr>
+                <w:sz w:val="16"/>
+                <w:szCs w:val="16"/>
+                <w:lang w:val="da-DK"/>
+              </w:rPr>
+              <w:t xml:space="preserve">under disse OUer der bliver </w:t>
+            </w:r>
+            <w:r>
+              <w:rPr>
+                <w:sz w:val="16"/>
+                <w:szCs w:val="16"/>
+                <w:lang w:val="da-DK"/>
+              </w:rPr>
+              <w:t>synkroniseret.</w:t>
+            </w:r>
+            <w:r>
+              <w:rPr>
+                <w:sz w:val="16"/>
+                <w:szCs w:val="16"/>
+                <w:lang w:val="da-DK"/>
+              </w:rPr>
+              <w:t xml:space="preserve"> </w:t>
+            </w:r>
+          </w:p>
+        </w:tc>
+      </w:tr>
+      <w:tr>
+        <w:tc>
+          <w:tcPr>
+            <w:cnfStyle w:val="001000000000" w:firstRow="0" w:lastRow="0" w:firstColumn="1" w:lastColumn="0" w:oddVBand="0" w:evenVBand="0" w:oddHBand="0" w:evenHBand="0" w:firstRowFirstColumn="0" w:firstRowLastColumn="0" w:lastRowFirstColumn="0" w:lastRowLastColumn="0"/>
+            <w:tcW w:w="4248" w:type="dxa"/>
+          </w:tcPr>
+          <w:p>
+            <w:pPr>
+              <w:rPr>
+                <w:b w:val="0"/>
+                <w:bCs w:val="0"/>
+                <w:sz w:val="16"/>
+                <w:szCs w:val="16"/>
+              </w:rPr>
+            </w:pPr>
+            <w:proofErr w:type="spellStart"/>
+            <w:r>
+              <w:rPr>
+                <w:b w:val="0"/>
+                <w:bCs w:val="0"/>
+                <w:sz w:val="16"/>
+                <w:szCs w:val="16"/>
+              </w:rPr>
               <w:t>ActiveDirectory.DisableAccountOrdersAttribute</w:t>
             </w:r>
             <w:proofErr w:type="spellEnd"/>
@@ -4805,6 +5065,7 @@
           </w:tcPr>
           <w:p>
             <w:pPr>
+              <w:cnfStyle w:val="000000000000" w:firstRow="0" w:lastRow="0" w:firstColumn="0" w:lastColumn="0" w:oddVBand="0" w:evenVBand="0" w:oddHBand="0" w:evenHBand="0" w:firstRowFirstColumn="0" w:firstRowLastColumn="0" w:lastRowFirstColumn="0" w:lastRowLastColumn="0"/>
               <w:rPr>
                 <w:sz w:val="16"/>
                 <w:szCs w:val="16"/>
@@ -4825,35 +5086,20 @@
           </w:tcPr>
           <w:p>
             <w:pPr>
-              <w:rPr>
-                <w:sz w:val="16"/>
-                <w:szCs w:val="16"/>
-                <w:lang w:val="da-DK"/>
-              </w:rPr>
-            </w:pPr>
-            <w:r>
-              <w:rPr>
-                <w:sz w:val="16"/>
-                <w:szCs w:val="16"/>
-                <w:lang w:val="da-DK"/>
-              </w:rPr>
-              <w:t xml:space="preserve">Såfremt den angive attribut er udfyldt med ”true” så vil integrationen sætte alle </w:t>
-            </w:r>
-            <w:r>
-              <w:rPr>
-                <w:sz w:val="16"/>
-                <w:szCs w:val="16"/>
-                <w:lang w:val="da-DK"/>
-              </w:rPr>
-              <w:t xml:space="preserve">IDM </w:t>
-            </w:r>
-            <w:r>
-              <w:rPr>
-                <w:sz w:val="16"/>
-                <w:szCs w:val="16"/>
-                <w:lang w:val="da-DK"/>
-              </w:rPr>
-              <w:t>undtagelsesmarkeringer på personen i OS2sofd.</w:t>
+              <w:cnfStyle w:val="000000000000" w:firstRow="0" w:lastRow="0" w:firstColumn="0" w:lastColumn="0" w:oddVBand="0" w:evenVBand="0" w:oddHBand="0" w:evenHBand="0" w:firstRowFirstColumn="0" w:firstRowLastColumn="0" w:lastRowFirstColumn="0" w:lastRowLastColumn="0"/>
+              <w:rPr>
+                <w:sz w:val="16"/>
+                <w:szCs w:val="16"/>
+                <w:lang w:val="da-DK"/>
+              </w:rPr>
+            </w:pPr>
+            <w:r>
+              <w:rPr>
+                <w:sz w:val="16"/>
+                <w:szCs w:val="16"/>
+                <w:lang w:val="da-DK"/>
+              </w:rPr>
+              <w:t>Såfremt den angive attribut er udfyldt med ”true” så vil integrationen sætte alle IDM undtagelsesmarkeringer på personen i OS2sofd.</w:t>
             </w:r>
             <w:r>
               <w:rPr>
@@ -4940,7 +5186,6 @@
           <w:tcPr>
             <w:cnfStyle w:val="001000000000" w:firstRow="0" w:lastRow="0" w:firstColumn="1" w:lastColumn="0" w:oddVBand="0" w:evenVBand="0" w:oddHBand="0" w:evenHBand="0" w:firstRowFirstColumn="0" w:firstRowLastColumn="0" w:lastRowFirstColumn="0" w:lastRowLastColumn="0"/>
             <w:tcW w:w="4248" w:type="dxa"/>
-            <w:shd w:val="clear" w:color="auto" w:fill="auto"/>
           </w:tcPr>
           <w:p>
             <w:pPr>
@@ -4967,7 +5212,6 @@
         <w:tc>
           <w:tcPr>
             <w:tcW w:w="1984" w:type="dxa"/>
-            <w:shd w:val="clear" w:color="auto" w:fill="auto"/>
           </w:tcPr>
           <w:p>
             <w:pPr>
@@ -4991,7 +5235,6 @@
         <w:tc>
           <w:tcPr>
             <w:tcW w:w="3396" w:type="dxa"/>
-            <w:shd w:val="clear" w:color="auto" w:fill="auto"/>
           </w:tcPr>
           <w:p>
             <w:pPr>
@@ -5018,7 +5261,6 @@
           <w:tcPr>
             <w:cnfStyle w:val="001000000000" w:firstRow="0" w:lastRow="0" w:firstColumn="1" w:lastColumn="0" w:oddVBand="0" w:evenVBand="0" w:oddHBand="0" w:evenHBand="0" w:firstRowFirstColumn="0" w:firstRowLastColumn="0" w:lastRowFirstColumn="0" w:lastRowLastColumn="0"/>
             <w:tcW w:w="4248" w:type="dxa"/>
-            <w:shd w:val="clear" w:color="auto" w:fill="auto"/>
           </w:tcPr>
           <w:p>
             <w:pPr>
@@ -5045,7 +5287,6 @@
         <w:tc>
           <w:tcPr>
             <w:tcW w:w="1984" w:type="dxa"/>
-            <w:shd w:val="clear" w:color="auto" w:fill="auto"/>
           </w:tcPr>
           <w:p>
             <w:pPr>
@@ -5072,7 +5313,6 @@
         <w:tc>
           <w:tcPr>
             <w:tcW w:w="3396" w:type="dxa"/>
-            <w:shd w:val="clear" w:color="auto" w:fill="auto"/>
           </w:tcPr>
           <w:p>
             <w:pPr>
@@ -5099,7 +5339,6 @@
           <w:tcPr>
             <w:cnfStyle w:val="001000000000" w:firstRow="0" w:lastRow="0" w:firstColumn="1" w:lastColumn="0" w:oddVBand="0" w:evenVBand="0" w:oddHBand="0" w:evenHBand="0" w:firstRowFirstColumn="0" w:firstRowLastColumn="0" w:lastRowFirstColumn="0" w:lastRowLastColumn="0"/>
             <w:tcW w:w="4248" w:type="dxa"/>
-            <w:shd w:val="clear" w:color="auto" w:fill="auto"/>
           </w:tcPr>
           <w:p>
             <w:pPr>
@@ -5126,7 +5365,6 @@
         <w:tc>
           <w:tcPr>
             <w:tcW w:w="1984" w:type="dxa"/>
-            <w:shd w:val="clear" w:color="auto" w:fill="auto"/>
           </w:tcPr>
           <w:p>
             <w:pPr>
@@ -5150,7 +5388,6 @@
         <w:tc>
           <w:tcPr>
             <w:tcW w:w="3396" w:type="dxa"/>
-            <w:shd w:val="clear" w:color="auto" w:fill="auto"/>
           </w:tcPr>
           <w:p>
             <w:pPr>
@@ -5190,6 +5427,7 @@
         <w:rPr>
           <w:lang w:val="da-DK"/>
         </w:rPr>
+        <w:lastRenderedPageBreak/>
         <w:t xml:space="preserve">Såfremt </w:t>
       </w:r>
       <w:r>
@@ -5223,7 +5461,6 @@
           <w:noProof/>
           <w:lang w:val="da-DK"/>
         </w:rPr>
-        <w:lastRenderedPageBreak/>
         <w:drawing>
           <wp:inline distT="0" distB="0" distL="0" distR="0" wp14:anchorId="25B9F0F1" wp14:editId="695D0F43">
             <wp:extent cx="3868714" cy="4459503"/>
@@ -5429,6 +5666,7 @@
           <w:sz w:val="16"/>
           <w:szCs w:val="16"/>
         </w:rPr>
+        <w:lastRenderedPageBreak/>
         <w:t>2019-09-04 06:00:04 [Information] [</w:t>
       </w:r>
       <w:proofErr w:type="spellStart"/>
@@ -5460,7 +5698,6 @@
           <w:sz w:val="16"/>
           <w:szCs w:val="16"/>
         </w:rPr>
-        <w:lastRenderedPageBreak/>
         <w:t>2019-09-04 06:00:06 [Information] [</w:t>
       </w:r>
       <w:proofErr w:type="spellStart"/>

</xml_diff>

<commit_message>
added some ui validation to new person ui
</commit_message>
<xml_diff>
--- a/doc/SOFD Core - AD indlaesningsintegration.docx
+++ b/doc/SOFD Core - AD indlaesningsintegration.docx
@@ -152,7 +152,7 @@
         <w:t>1.</w:t>
       </w:r>
       <w:r>
-        <w:t>9</w:t>
+        <w:t>10</w:t>
       </w:r>
       <w:r>
         <w:t>.0</w:t>
@@ -174,7 +174,9 @@
       </w:r>
       <w:r>
         <w:tab/>
-        <w:t>07</w:t>
+      </w:r>
+      <w:r>
+        <w:t>03</w:t>
       </w:r>
       <w:r>
         <w:t>.</w:t>
@@ -183,7 +185,7 @@
         <w:t>0</w:t>
       </w:r>
       <w:r>
-        <w:t>3</w:t>
+        <w:t>1</w:t>
       </w:r>
       <w:r>
         <w:t>.20</w:t>
@@ -192,7 +194,7 @@
         <w:t>2</w:t>
       </w:r>
       <w:r>
-        <w:t>2</w:t>
+        <w:t>5</w:t>
       </w:r>
     </w:p>
     <w:p>
@@ -213,7 +215,7 @@
         <w:tab/>
       </w:r>
       <w:r>
-        <w:t>BSG</w:t>
+        <w:t>PSO</w:t>
       </w:r>
     </w:p>
     <w:p>
@@ -1126,7 +1128,23 @@
                 <w:noProof/>
                 <w:lang w:val="da-DK"/>
               </w:rPr>
-              <w:t>Konfiguration af service</w:t>
+              <w:t>Konfigu</w:t>
+            </w:r>
+            <w:r>
+              <w:rPr>
+                <w:rStyle w:val="Hyperlink"/>
+                <w:noProof/>
+                <w:lang w:val="da-DK"/>
+              </w:rPr>
+              <w:t>r</w:t>
+            </w:r>
+            <w:r>
+              <w:rPr>
+                <w:rStyle w:val="Hyperlink"/>
+                <w:noProof/>
+                <w:lang w:val="da-DK"/>
+              </w:rPr>
+              <w:t>ation af service</w:t>
             </w:r>
             <w:r>
               <w:rPr>
@@ -4656,7 +4674,7 @@
                 <w:sz w:val="16"/>
                 <w:szCs w:val="16"/>
               </w:rPr>
-              <w:t>”OU=old</w:t>
+              <w:t>OU=old</w:t>
             </w:r>
             <w:r>
               <w:rPr>
@@ -4743,7 +4761,7 @@
                 <w:sz w:val="16"/>
                 <w:szCs w:val="16"/>
               </w:rPr>
-              <w:t>=dk”</w:t>
+              <w:t>=dk</w:t>
             </w:r>
           </w:p>
         </w:tc>
@@ -4766,7 +4784,23 @@
                 <w:szCs w:val="16"/>
                 <w:lang w:val="da-DK"/>
               </w:rPr>
-              <w:t xml:space="preserve">En ;-separeret liste af enheders distinguished name. Brugere i enhederne, der listes her, bliver ikke synkroniseret.  </w:t>
+              <w:t xml:space="preserve">En </w:t>
+            </w:r>
+            <w:r>
+              <w:rPr>
+                <w:sz w:val="16"/>
+                <w:szCs w:val="16"/>
+                <w:lang w:val="da-DK"/>
+              </w:rPr>
+              <w:t>semikolon</w:t>
+            </w:r>
+            <w:r>
+              <w:rPr>
+                <w:sz w:val="16"/>
+                <w:szCs w:val="16"/>
+                <w:lang w:val="da-DK"/>
+              </w:rPr>
+              <w:t xml:space="preserve">-separeret liste af enheders distinguished name. Brugere i enhederne, der listes her, bliver ikke synkroniseret.  </w:t>
             </w:r>
           </w:p>
         </w:tc>
@@ -4774,19 +4808,26 @@
       <w:tr>
         <w:tc>
           <w:tcPr>
+            <w:cnfStyle w:val="001000000000" w:firstRow="0" w:lastRow="0" w:firstColumn="1" w:lastColumn="0" w:oddVBand="0" w:evenVBand="0" w:oddHBand="0" w:evenHBand="0" w:firstRowFirstColumn="0" w:firstRowLastColumn="0" w:lastRowFirstColumn="0" w:lastRowLastColumn="0"/>
             <w:tcW w:w="4248" w:type="dxa"/>
           </w:tcPr>
           <w:p>
             <w:pPr>
-              <w:cnfStyle w:val="001000000000" w:firstRow="0" w:lastRow="0" w:firstColumn="1" w:lastColumn="0" w:oddVBand="0" w:evenVBand="0" w:oddHBand="0" w:evenHBand="0" w:firstRowFirstColumn="0" w:firstRowLastColumn="0" w:lastRowFirstColumn="0" w:lastRowLastColumn="0"/>
+              <w:rPr>
+                <w:sz w:val="16"/>
+                <w:szCs w:val="16"/>
+              </w:rPr>
+            </w:pPr>
+            <w:proofErr w:type="spellStart"/>
+            <w:r>
               <w:rPr>
                 <w:b w:val="0"/>
                 <w:bCs w:val="0"/>
                 <w:sz w:val="16"/>
                 <w:szCs w:val="16"/>
               </w:rPr>
-            </w:pPr>
-            <w:proofErr w:type="spellStart"/>
+              <w:t>ActiveDirectory.</w:t>
+            </w:r>
             <w:r>
               <w:rPr>
                 <w:b w:val="0"/>
@@ -4794,6 +4835,225 @@
                 <w:sz w:val="16"/>
                 <w:szCs w:val="16"/>
               </w:rPr>
+              <w:t>In</w:t>
+            </w:r>
+            <w:r>
+              <w:rPr>
+                <w:b w:val="0"/>
+                <w:bCs w:val="0"/>
+                <w:sz w:val="16"/>
+                <w:szCs w:val="16"/>
+              </w:rPr>
+              <w:t>cludeOUs</w:t>
+            </w:r>
+            <w:proofErr w:type="spellEnd"/>
+          </w:p>
+        </w:tc>
+        <w:tc>
+          <w:tcPr>
+            <w:tcW w:w="1984" w:type="dxa"/>
+          </w:tcPr>
+          <w:p>
+            <w:pPr>
+              <w:cnfStyle w:val="000000000000" w:firstRow="0" w:lastRow="0" w:firstColumn="0" w:lastColumn="0" w:oddVBand="0" w:evenVBand="0" w:oddHBand="0" w:evenHBand="0" w:firstRowFirstColumn="0" w:firstRowLastColumn="0" w:lastRowFirstColumn="0" w:lastRowLastColumn="0"/>
+              <w:rPr>
+                <w:sz w:val="16"/>
+                <w:szCs w:val="16"/>
+              </w:rPr>
+            </w:pPr>
+            <w:r>
+              <w:rPr>
+                <w:sz w:val="16"/>
+                <w:szCs w:val="16"/>
+              </w:rPr>
+              <w:t xml:space="preserve">OU=old </w:t>
+            </w:r>
+            <w:proofErr w:type="spellStart"/>
+            <w:r>
+              <w:rPr>
+                <w:sz w:val="16"/>
+                <w:szCs w:val="16"/>
+              </w:rPr>
+              <w:t>users,OU</w:t>
+            </w:r>
+            <w:proofErr w:type="spellEnd"/>
+            <w:r>
+              <w:rPr>
+                <w:sz w:val="16"/>
+                <w:szCs w:val="16"/>
+              </w:rPr>
+              <w:t>=</w:t>
+            </w:r>
+            <w:proofErr w:type="spellStart"/>
+            <w:r>
+              <w:rPr>
+                <w:sz w:val="16"/>
+                <w:szCs w:val="16"/>
+              </w:rPr>
+              <w:t>testkøbing,DC</w:t>
+            </w:r>
+            <w:proofErr w:type="spellEnd"/>
+            <w:r>
+              <w:rPr>
+                <w:sz w:val="16"/>
+                <w:szCs w:val="16"/>
+              </w:rPr>
+              <w:t>=</w:t>
+            </w:r>
+            <w:proofErr w:type="spellStart"/>
+            <w:r>
+              <w:rPr>
+                <w:sz w:val="16"/>
+                <w:szCs w:val="16"/>
+              </w:rPr>
+              <w:t>test,DC</w:t>
+            </w:r>
+            <w:proofErr w:type="spellEnd"/>
+            <w:r>
+              <w:rPr>
+                <w:sz w:val="16"/>
+                <w:szCs w:val="16"/>
+              </w:rPr>
+              <w:t>=dk; OU=old users 2,OU=</w:t>
+            </w:r>
+            <w:proofErr w:type="spellStart"/>
+            <w:r>
+              <w:rPr>
+                <w:sz w:val="16"/>
+                <w:szCs w:val="16"/>
+              </w:rPr>
+              <w:t>testkøbing,DC</w:t>
+            </w:r>
+            <w:proofErr w:type="spellEnd"/>
+            <w:r>
+              <w:rPr>
+                <w:sz w:val="16"/>
+                <w:szCs w:val="16"/>
+              </w:rPr>
+              <w:t>=</w:t>
+            </w:r>
+            <w:proofErr w:type="spellStart"/>
+            <w:r>
+              <w:rPr>
+                <w:sz w:val="16"/>
+                <w:szCs w:val="16"/>
+              </w:rPr>
+              <w:t>test,DC</w:t>
+            </w:r>
+            <w:proofErr w:type="spellEnd"/>
+            <w:r>
+              <w:rPr>
+                <w:sz w:val="16"/>
+                <w:szCs w:val="16"/>
+              </w:rPr>
+              <w:t>=dk</w:t>
+            </w:r>
+          </w:p>
+        </w:tc>
+        <w:tc>
+          <w:tcPr>
+            <w:tcW w:w="3396" w:type="dxa"/>
+          </w:tcPr>
+          <w:p>
+            <w:pPr>
+              <w:cnfStyle w:val="000000000000" w:firstRow="0" w:lastRow="0" w:firstColumn="0" w:lastColumn="0" w:oddVBand="0" w:evenVBand="0" w:oddHBand="0" w:evenHBand="0" w:firstRowFirstColumn="0" w:firstRowLastColumn="0" w:lastRowFirstColumn="0" w:lastRowLastColumn="0"/>
+              <w:rPr>
+                <w:sz w:val="16"/>
+                <w:szCs w:val="16"/>
+                <w:lang w:val="da-DK"/>
+              </w:rPr>
+            </w:pPr>
+            <w:r>
+              <w:rPr>
+                <w:sz w:val="16"/>
+                <w:szCs w:val="16"/>
+                <w:lang w:val="da-DK"/>
+              </w:rPr>
+              <w:t xml:space="preserve">En </w:t>
+            </w:r>
+            <w:r>
+              <w:rPr>
+                <w:sz w:val="16"/>
+                <w:szCs w:val="16"/>
+                <w:lang w:val="da-DK"/>
+              </w:rPr>
+              <w:t>semikolon</w:t>
+            </w:r>
+            <w:r>
+              <w:rPr>
+                <w:sz w:val="16"/>
+                <w:szCs w:val="16"/>
+                <w:lang w:val="da-DK"/>
+              </w:rPr>
+              <w:t xml:space="preserve">-separeret liste af enheders distinguished name. </w:t>
+            </w:r>
+            <w:r>
+              <w:rPr>
+                <w:sz w:val="16"/>
+                <w:szCs w:val="16"/>
+                <w:lang w:val="da-DK"/>
+              </w:rPr>
+              <w:br/>
+              <w:t>Såfremt denne liste ikke er tom, er det kun b</w:t>
+            </w:r>
+            <w:r>
+              <w:rPr>
+                <w:sz w:val="16"/>
+                <w:szCs w:val="16"/>
+                <w:lang w:val="da-DK"/>
+              </w:rPr>
+              <w:t xml:space="preserve">rugere </w:t>
+            </w:r>
+            <w:r>
+              <w:rPr>
+                <w:sz w:val="16"/>
+                <w:szCs w:val="16"/>
+                <w:lang w:val="da-DK"/>
+              </w:rPr>
+              <w:t xml:space="preserve">under disse OUer der bliver </w:t>
+            </w:r>
+            <w:r>
+              <w:rPr>
+                <w:sz w:val="16"/>
+                <w:szCs w:val="16"/>
+                <w:lang w:val="da-DK"/>
+              </w:rPr>
+              <w:t>synkroniseret.</w:t>
+            </w:r>
+            <w:r>
+              <w:rPr>
+                <w:sz w:val="16"/>
+                <w:szCs w:val="16"/>
+                <w:lang w:val="da-DK"/>
+              </w:rPr>
+              <w:t xml:space="preserve"> </w:t>
+            </w:r>
+          </w:p>
+        </w:tc>
+      </w:tr>
+      <w:tr>
+        <w:tc>
+          <w:tcPr>
+            <w:cnfStyle w:val="001000000000" w:firstRow="0" w:lastRow="0" w:firstColumn="1" w:lastColumn="0" w:oddVBand="0" w:evenVBand="0" w:oddHBand="0" w:evenHBand="0" w:firstRowFirstColumn="0" w:firstRowLastColumn="0" w:lastRowFirstColumn="0" w:lastRowLastColumn="0"/>
+            <w:tcW w:w="4248" w:type="dxa"/>
+          </w:tcPr>
+          <w:p>
+            <w:pPr>
+              <w:rPr>
+                <w:b w:val="0"/>
+                <w:bCs w:val="0"/>
+                <w:sz w:val="16"/>
+                <w:szCs w:val="16"/>
+              </w:rPr>
+            </w:pPr>
+            <w:proofErr w:type="spellStart"/>
+            <w:r>
+              <w:rPr>
+                <w:b w:val="0"/>
+                <w:bCs w:val="0"/>
+                <w:sz w:val="16"/>
+                <w:szCs w:val="16"/>
+              </w:rPr>
               <w:t>ActiveDirectory.DisableAccountOrdersAttribute</w:t>
             </w:r>
             <w:proofErr w:type="spellEnd"/>
@@ -4805,6 +5065,7 @@
           </w:tcPr>
           <w:p>
             <w:pPr>
+              <w:cnfStyle w:val="000000000000" w:firstRow="0" w:lastRow="0" w:firstColumn="0" w:lastColumn="0" w:oddVBand="0" w:evenVBand="0" w:oddHBand="0" w:evenHBand="0" w:firstRowFirstColumn="0" w:firstRowLastColumn="0" w:lastRowFirstColumn="0" w:lastRowLastColumn="0"/>
               <w:rPr>
                 <w:sz w:val="16"/>
                 <w:szCs w:val="16"/>
@@ -4825,35 +5086,20 @@
           </w:tcPr>
           <w:p>
             <w:pPr>
-              <w:rPr>
-                <w:sz w:val="16"/>
-                <w:szCs w:val="16"/>
-                <w:lang w:val="da-DK"/>
-              </w:rPr>
-            </w:pPr>
-            <w:r>
-              <w:rPr>
-                <w:sz w:val="16"/>
-                <w:szCs w:val="16"/>
-                <w:lang w:val="da-DK"/>
-              </w:rPr>
-              <w:t xml:space="preserve">Såfremt den angive attribut er udfyldt med ”true” så vil integrationen sætte alle </w:t>
-            </w:r>
-            <w:r>
-              <w:rPr>
-                <w:sz w:val="16"/>
-                <w:szCs w:val="16"/>
-                <w:lang w:val="da-DK"/>
-              </w:rPr>
-              <w:t xml:space="preserve">IDM </w:t>
-            </w:r>
-            <w:r>
-              <w:rPr>
-                <w:sz w:val="16"/>
-                <w:szCs w:val="16"/>
-                <w:lang w:val="da-DK"/>
-              </w:rPr>
-              <w:t>undtagelsesmarkeringer på personen i OS2sofd.</w:t>
+              <w:cnfStyle w:val="000000000000" w:firstRow="0" w:lastRow="0" w:firstColumn="0" w:lastColumn="0" w:oddVBand="0" w:evenVBand="0" w:oddHBand="0" w:evenHBand="0" w:firstRowFirstColumn="0" w:firstRowLastColumn="0" w:lastRowFirstColumn="0" w:lastRowLastColumn="0"/>
+              <w:rPr>
+                <w:sz w:val="16"/>
+                <w:szCs w:val="16"/>
+                <w:lang w:val="da-DK"/>
+              </w:rPr>
+            </w:pPr>
+            <w:r>
+              <w:rPr>
+                <w:sz w:val="16"/>
+                <w:szCs w:val="16"/>
+                <w:lang w:val="da-DK"/>
+              </w:rPr>
+              <w:t>Såfremt den angive attribut er udfyldt med ”true” så vil integrationen sætte alle IDM undtagelsesmarkeringer på personen i OS2sofd.</w:t>
             </w:r>
             <w:r>
               <w:rPr>
@@ -4940,7 +5186,6 @@
           <w:tcPr>
             <w:cnfStyle w:val="001000000000" w:firstRow="0" w:lastRow="0" w:firstColumn="1" w:lastColumn="0" w:oddVBand="0" w:evenVBand="0" w:oddHBand="0" w:evenHBand="0" w:firstRowFirstColumn="0" w:firstRowLastColumn="0" w:lastRowFirstColumn="0" w:lastRowLastColumn="0"/>
             <w:tcW w:w="4248" w:type="dxa"/>
-            <w:shd w:val="clear" w:color="auto" w:fill="auto"/>
           </w:tcPr>
           <w:p>
             <w:pPr>
@@ -4967,7 +5212,6 @@
         <w:tc>
           <w:tcPr>
             <w:tcW w:w="1984" w:type="dxa"/>
-            <w:shd w:val="clear" w:color="auto" w:fill="auto"/>
           </w:tcPr>
           <w:p>
             <w:pPr>
@@ -4991,7 +5235,6 @@
         <w:tc>
           <w:tcPr>
             <w:tcW w:w="3396" w:type="dxa"/>
-            <w:shd w:val="clear" w:color="auto" w:fill="auto"/>
           </w:tcPr>
           <w:p>
             <w:pPr>
@@ -5018,7 +5261,6 @@
           <w:tcPr>
             <w:cnfStyle w:val="001000000000" w:firstRow="0" w:lastRow="0" w:firstColumn="1" w:lastColumn="0" w:oddVBand="0" w:evenVBand="0" w:oddHBand="0" w:evenHBand="0" w:firstRowFirstColumn="0" w:firstRowLastColumn="0" w:lastRowFirstColumn="0" w:lastRowLastColumn="0"/>
             <w:tcW w:w="4248" w:type="dxa"/>
-            <w:shd w:val="clear" w:color="auto" w:fill="auto"/>
           </w:tcPr>
           <w:p>
             <w:pPr>
@@ -5045,7 +5287,6 @@
         <w:tc>
           <w:tcPr>
             <w:tcW w:w="1984" w:type="dxa"/>
-            <w:shd w:val="clear" w:color="auto" w:fill="auto"/>
           </w:tcPr>
           <w:p>
             <w:pPr>
@@ -5072,7 +5313,6 @@
         <w:tc>
           <w:tcPr>
             <w:tcW w:w="3396" w:type="dxa"/>
-            <w:shd w:val="clear" w:color="auto" w:fill="auto"/>
           </w:tcPr>
           <w:p>
             <w:pPr>
@@ -5099,7 +5339,6 @@
           <w:tcPr>
             <w:cnfStyle w:val="001000000000" w:firstRow="0" w:lastRow="0" w:firstColumn="1" w:lastColumn="0" w:oddVBand="0" w:evenVBand="0" w:oddHBand="0" w:evenHBand="0" w:firstRowFirstColumn="0" w:firstRowLastColumn="0" w:lastRowFirstColumn="0" w:lastRowLastColumn="0"/>
             <w:tcW w:w="4248" w:type="dxa"/>
-            <w:shd w:val="clear" w:color="auto" w:fill="auto"/>
           </w:tcPr>
           <w:p>
             <w:pPr>
@@ -5126,7 +5365,6 @@
         <w:tc>
           <w:tcPr>
             <w:tcW w:w="1984" w:type="dxa"/>
-            <w:shd w:val="clear" w:color="auto" w:fill="auto"/>
           </w:tcPr>
           <w:p>
             <w:pPr>
@@ -5150,7 +5388,6 @@
         <w:tc>
           <w:tcPr>
             <w:tcW w:w="3396" w:type="dxa"/>
-            <w:shd w:val="clear" w:color="auto" w:fill="auto"/>
           </w:tcPr>
           <w:p>
             <w:pPr>
@@ -5190,6 +5427,7 @@
         <w:rPr>
           <w:lang w:val="da-DK"/>
         </w:rPr>
+        <w:lastRenderedPageBreak/>
         <w:t xml:space="preserve">Såfremt </w:t>
       </w:r>
       <w:r>
@@ -5223,7 +5461,6 @@
           <w:noProof/>
           <w:lang w:val="da-DK"/>
         </w:rPr>
-        <w:lastRenderedPageBreak/>
         <w:drawing>
           <wp:inline distT="0" distB="0" distL="0" distR="0" wp14:anchorId="25B9F0F1" wp14:editId="695D0F43">
             <wp:extent cx="3868714" cy="4459503"/>
@@ -5429,6 +5666,7 @@
           <w:sz w:val="16"/>
           <w:szCs w:val="16"/>
         </w:rPr>
+        <w:lastRenderedPageBreak/>
         <w:t>2019-09-04 06:00:04 [Information] [</w:t>
       </w:r>
       <w:proofErr w:type="spellStart"/>
@@ -5460,7 +5698,6 @@
           <w:sz w:val="16"/>
           <w:szCs w:val="16"/>
         </w:rPr>
-        <w:lastRenderedPageBreak/>
         <w:t>2019-09-04 06:00:06 [Information] [</w:t>
       </w:r>
       <w:proofErr w:type="spellStart"/>

</xml_diff>

<commit_message>
Merged 2025R4 into CORE-635
</commit_message>
<xml_diff>
--- a/doc/SOFD Core - AD indlaesningsintegration.docx
+++ b/doc/SOFD Core - AD indlaesningsintegration.docx
@@ -152,7 +152,7 @@
         <w:t>1.</w:t>
       </w:r>
       <w:r>
-        <w:t>10</w:t>
+        <w:t>9</w:t>
       </w:r>
       <w:r>
         <w:t>.0</w:t>
@@ -174,9 +174,7 @@
       </w:r>
       <w:r>
         <w:tab/>
-      </w:r>
-      <w:r>
-        <w:t>03</w:t>
+        <w:t>07</w:t>
       </w:r>
       <w:r>
         <w:t>.</w:t>
@@ -185,7 +183,7 @@
         <w:t>0</w:t>
       </w:r>
       <w:r>
-        <w:t>1</w:t>
+        <w:t>3</w:t>
       </w:r>
       <w:r>
         <w:t>.20</w:t>
@@ -194,7 +192,7 @@
         <w:t>2</w:t>
       </w:r>
       <w:r>
-        <w:t>5</w:t>
+        <w:t>2</w:t>
       </w:r>
     </w:p>
     <w:p>
@@ -215,7 +213,7 @@
         <w:tab/>
       </w:r>
       <w:r>
-        <w:t>PSO</w:t>
+        <w:t>BSG</w:t>
       </w:r>
     </w:p>
     <w:p>
@@ -1128,23 +1126,7 @@
                 <w:noProof/>
                 <w:lang w:val="da-DK"/>
               </w:rPr>
-              <w:t>Konfigu</w:t>
-            </w:r>
-            <w:r>
-              <w:rPr>
-                <w:rStyle w:val="Hyperlink"/>
-                <w:noProof/>
-                <w:lang w:val="da-DK"/>
-              </w:rPr>
-              <w:t>r</w:t>
-            </w:r>
-            <w:r>
-              <w:rPr>
-                <w:rStyle w:val="Hyperlink"/>
-                <w:noProof/>
-                <w:lang w:val="da-DK"/>
-              </w:rPr>
-              <w:t>ation af service</w:t>
+              <w:t>Konfiguration af service</w:t>
             </w:r>
             <w:r>
               <w:rPr>
@@ -4674,7 +4656,7 @@
                 <w:sz w:val="16"/>
                 <w:szCs w:val="16"/>
               </w:rPr>
-              <w:t>OU=old</w:t>
+              <w:t>”OU=old</w:t>
             </w:r>
             <w:r>
               <w:rPr>
@@ -4761,7 +4743,7 @@
                 <w:sz w:val="16"/>
                 <w:szCs w:val="16"/>
               </w:rPr>
-              <w:t>=dk</w:t>
+              <w:t>=dk”</w:t>
             </w:r>
           </w:p>
         </w:tc>
@@ -4784,23 +4766,7 @@
                 <w:szCs w:val="16"/>
                 <w:lang w:val="da-DK"/>
               </w:rPr>
-              <w:t xml:space="preserve">En </w:t>
-            </w:r>
-            <w:r>
-              <w:rPr>
-                <w:sz w:val="16"/>
-                <w:szCs w:val="16"/>
-                <w:lang w:val="da-DK"/>
-              </w:rPr>
-              <w:t>semikolon</w:t>
-            </w:r>
-            <w:r>
-              <w:rPr>
-                <w:sz w:val="16"/>
-                <w:szCs w:val="16"/>
-                <w:lang w:val="da-DK"/>
-              </w:rPr>
-              <w:t xml:space="preserve">-separeret liste af enheders distinguished name. Brugere i enhederne, der listes her, bliver ikke synkroniseret.  </w:t>
+              <w:t xml:space="preserve">En ;-separeret liste af enheders distinguished name. Brugere i enhederne, der listes her, bliver ikke synkroniseret.  </w:t>
             </w:r>
           </w:p>
         </w:tc>
@@ -4808,26 +4774,19 @@
       <w:tr>
         <w:tc>
           <w:tcPr>
-            <w:cnfStyle w:val="001000000000" w:firstRow="0" w:lastRow="0" w:firstColumn="1" w:lastColumn="0" w:oddVBand="0" w:evenVBand="0" w:oddHBand="0" w:evenHBand="0" w:firstRowFirstColumn="0" w:firstRowLastColumn="0" w:lastRowFirstColumn="0" w:lastRowLastColumn="0"/>
             <w:tcW w:w="4248" w:type="dxa"/>
           </w:tcPr>
           <w:p>
             <w:pPr>
-              <w:rPr>
-                <w:sz w:val="16"/>
-                <w:szCs w:val="16"/>
-              </w:rPr>
-            </w:pPr>
-            <w:proofErr w:type="spellStart"/>
-            <w:r>
+              <w:cnfStyle w:val="001000000000" w:firstRow="0" w:lastRow="0" w:firstColumn="1" w:lastColumn="0" w:oddVBand="0" w:evenVBand="0" w:oddHBand="0" w:evenHBand="0" w:firstRowFirstColumn="0" w:firstRowLastColumn="0" w:lastRowFirstColumn="0" w:lastRowLastColumn="0"/>
               <w:rPr>
                 <w:b w:val="0"/>
                 <w:bCs w:val="0"/>
                 <w:sz w:val="16"/>
                 <w:szCs w:val="16"/>
               </w:rPr>
-              <w:t>ActiveDirectory.</w:t>
-            </w:r>
+            </w:pPr>
+            <w:proofErr w:type="spellStart"/>
             <w:r>
               <w:rPr>
                 <w:b w:val="0"/>
@@ -4835,16 +4794,7 @@
                 <w:sz w:val="16"/>
                 <w:szCs w:val="16"/>
               </w:rPr>
-              <w:t>In</w:t>
-            </w:r>
-            <w:r>
-              <w:rPr>
-                <w:b w:val="0"/>
-                <w:bCs w:val="0"/>
-                <w:sz w:val="16"/>
-                <w:szCs w:val="16"/>
-              </w:rPr>
-              <w:t>cludeOUs</w:t>
+              <w:t>ActiveDirectory.DisableAccountOrdersAttribute</w:t>
             </w:r>
             <w:proofErr w:type="spellEnd"/>
           </w:p>
@@ -4855,98 +4805,17 @@
           </w:tcPr>
           <w:p>
             <w:pPr>
-              <w:cnfStyle w:val="000000000000" w:firstRow="0" w:lastRow="0" w:firstColumn="0" w:lastColumn="0" w:oddVBand="0" w:evenVBand="0" w:oddHBand="0" w:evenHBand="0" w:firstRowFirstColumn="0" w:firstRowLastColumn="0" w:lastRowFirstColumn="0" w:lastRowLastColumn="0"/>
-              <w:rPr>
-                <w:sz w:val="16"/>
-                <w:szCs w:val="16"/>
-              </w:rPr>
-            </w:pPr>
-            <w:r>
-              <w:rPr>
-                <w:sz w:val="16"/>
-                <w:szCs w:val="16"/>
-              </w:rPr>
-              <w:t xml:space="preserve">OU=old </w:t>
-            </w:r>
-            <w:proofErr w:type="spellStart"/>
-            <w:r>
-              <w:rPr>
-                <w:sz w:val="16"/>
-                <w:szCs w:val="16"/>
-              </w:rPr>
-              <w:t>users,OU</w:t>
-            </w:r>
-            <w:proofErr w:type="spellEnd"/>
-            <w:r>
-              <w:rPr>
-                <w:sz w:val="16"/>
-                <w:szCs w:val="16"/>
-              </w:rPr>
-              <w:t>=</w:t>
-            </w:r>
-            <w:proofErr w:type="spellStart"/>
-            <w:r>
-              <w:rPr>
-                <w:sz w:val="16"/>
-                <w:szCs w:val="16"/>
-              </w:rPr>
-              <w:t>testkøbing,DC</w:t>
-            </w:r>
-            <w:proofErr w:type="spellEnd"/>
-            <w:r>
-              <w:rPr>
-                <w:sz w:val="16"/>
-                <w:szCs w:val="16"/>
-              </w:rPr>
-              <w:t>=</w:t>
-            </w:r>
-            <w:proofErr w:type="spellStart"/>
-            <w:r>
-              <w:rPr>
-                <w:sz w:val="16"/>
-                <w:szCs w:val="16"/>
-              </w:rPr>
-              <w:t>test,DC</w:t>
-            </w:r>
-            <w:proofErr w:type="spellEnd"/>
-            <w:r>
-              <w:rPr>
-                <w:sz w:val="16"/>
-                <w:szCs w:val="16"/>
-              </w:rPr>
-              <w:t>=dk; OU=old users 2,OU=</w:t>
-            </w:r>
-            <w:proofErr w:type="spellStart"/>
-            <w:r>
-              <w:rPr>
-                <w:sz w:val="16"/>
-                <w:szCs w:val="16"/>
-              </w:rPr>
-              <w:t>testkøbing,DC</w:t>
-            </w:r>
-            <w:proofErr w:type="spellEnd"/>
-            <w:r>
-              <w:rPr>
-                <w:sz w:val="16"/>
-                <w:szCs w:val="16"/>
-              </w:rPr>
-              <w:t>=</w:t>
-            </w:r>
-            <w:proofErr w:type="spellStart"/>
-            <w:r>
-              <w:rPr>
-                <w:sz w:val="16"/>
-                <w:szCs w:val="16"/>
-              </w:rPr>
-              <w:t>test,DC</w:t>
-            </w:r>
-            <w:proofErr w:type="spellEnd"/>
-            <w:r>
-              <w:rPr>
-                <w:sz w:val="16"/>
-                <w:szCs w:val="16"/>
-              </w:rPr>
-              <w:t>=dk</w:t>
+              <w:rPr>
+                <w:sz w:val="16"/>
+                <w:szCs w:val="16"/>
+              </w:rPr>
+            </w:pPr>
+            <w:r>
+              <w:rPr>
+                <w:sz w:val="16"/>
+                <w:szCs w:val="16"/>
+              </w:rPr>
+              <w:t>extensionAttribute10</w:t>
             </w:r>
           </w:p>
         </w:tc>
@@ -4956,150 +4825,35 @@
           </w:tcPr>
           <w:p>
             <w:pPr>
-              <w:cnfStyle w:val="000000000000" w:firstRow="0" w:lastRow="0" w:firstColumn="0" w:lastColumn="0" w:oddVBand="0" w:evenVBand="0" w:oddHBand="0" w:evenHBand="0" w:firstRowFirstColumn="0" w:firstRowLastColumn="0" w:lastRowFirstColumn="0" w:lastRowLastColumn="0"/>
-              <w:rPr>
-                <w:sz w:val="16"/>
-                <w:szCs w:val="16"/>
-                <w:lang w:val="da-DK"/>
-              </w:rPr>
-            </w:pPr>
-            <w:r>
-              <w:rPr>
-                <w:sz w:val="16"/>
-                <w:szCs w:val="16"/>
-                <w:lang w:val="da-DK"/>
-              </w:rPr>
-              <w:t xml:space="preserve">En </w:t>
-            </w:r>
-            <w:r>
-              <w:rPr>
-                <w:sz w:val="16"/>
-                <w:szCs w:val="16"/>
-                <w:lang w:val="da-DK"/>
-              </w:rPr>
-              <w:t>semikolon</w:t>
-            </w:r>
-            <w:r>
-              <w:rPr>
-                <w:sz w:val="16"/>
-                <w:szCs w:val="16"/>
-                <w:lang w:val="da-DK"/>
-              </w:rPr>
-              <w:t xml:space="preserve">-separeret liste af enheders distinguished name. </w:t>
-            </w:r>
-            <w:r>
-              <w:rPr>
-                <w:sz w:val="16"/>
-                <w:szCs w:val="16"/>
-                <w:lang w:val="da-DK"/>
-              </w:rPr>
-              <w:br/>
-              <w:t>Såfremt denne liste ikke er tom, er det kun b</w:t>
-            </w:r>
-            <w:r>
-              <w:rPr>
-                <w:sz w:val="16"/>
-                <w:szCs w:val="16"/>
-                <w:lang w:val="da-DK"/>
-              </w:rPr>
-              <w:t xml:space="preserve">rugere </w:t>
-            </w:r>
-            <w:r>
-              <w:rPr>
-                <w:sz w:val="16"/>
-                <w:szCs w:val="16"/>
-                <w:lang w:val="da-DK"/>
-              </w:rPr>
-              <w:t xml:space="preserve">under disse OUer der bliver </w:t>
-            </w:r>
-            <w:r>
-              <w:rPr>
-                <w:sz w:val="16"/>
-                <w:szCs w:val="16"/>
-                <w:lang w:val="da-DK"/>
-              </w:rPr>
-              <w:t>synkroniseret.</w:t>
-            </w:r>
-            <w:r>
-              <w:rPr>
-                <w:sz w:val="16"/>
-                <w:szCs w:val="16"/>
-                <w:lang w:val="da-DK"/>
-              </w:rPr>
-              <w:t xml:space="preserve"> </w:t>
-            </w:r>
-          </w:p>
-        </w:tc>
-      </w:tr>
-      <w:tr>
-        <w:tc>
-          <w:tcPr>
-            <w:cnfStyle w:val="001000000000" w:firstRow="0" w:lastRow="0" w:firstColumn="1" w:lastColumn="0" w:oddVBand="0" w:evenVBand="0" w:oddHBand="0" w:evenHBand="0" w:firstRowFirstColumn="0" w:firstRowLastColumn="0" w:lastRowFirstColumn="0" w:lastRowLastColumn="0"/>
-            <w:tcW w:w="4248" w:type="dxa"/>
-          </w:tcPr>
-          <w:p>
-            <w:pPr>
-              <w:rPr>
-                <w:b w:val="0"/>
-                <w:bCs w:val="0"/>
-                <w:sz w:val="16"/>
-                <w:szCs w:val="16"/>
-              </w:rPr>
-            </w:pPr>
-            <w:proofErr w:type="spellStart"/>
-            <w:r>
-              <w:rPr>
-                <w:b w:val="0"/>
-                <w:bCs w:val="0"/>
-                <w:sz w:val="16"/>
-                <w:szCs w:val="16"/>
-              </w:rPr>
-              <w:t>ActiveDirectory.DisableAccountOrdersAttribute</w:t>
-            </w:r>
-            <w:proofErr w:type="spellEnd"/>
-          </w:p>
-        </w:tc>
-        <w:tc>
-          <w:tcPr>
-            <w:tcW w:w="1984" w:type="dxa"/>
-          </w:tcPr>
-          <w:p>
-            <w:pPr>
-              <w:cnfStyle w:val="000000000000" w:firstRow="0" w:lastRow="0" w:firstColumn="0" w:lastColumn="0" w:oddVBand="0" w:evenVBand="0" w:oddHBand="0" w:evenHBand="0" w:firstRowFirstColumn="0" w:firstRowLastColumn="0" w:lastRowFirstColumn="0" w:lastRowLastColumn="0"/>
-              <w:rPr>
-                <w:sz w:val="16"/>
-                <w:szCs w:val="16"/>
-              </w:rPr>
-            </w:pPr>
-            <w:r>
-              <w:rPr>
-                <w:sz w:val="16"/>
-                <w:szCs w:val="16"/>
-              </w:rPr>
-              <w:t>extensionAttribute10</w:t>
-            </w:r>
-          </w:p>
-        </w:tc>
-        <w:tc>
-          <w:tcPr>
-            <w:tcW w:w="3396" w:type="dxa"/>
-          </w:tcPr>
-          <w:p>
-            <w:pPr>
-              <w:cnfStyle w:val="000000000000" w:firstRow="0" w:lastRow="0" w:firstColumn="0" w:lastColumn="0" w:oddVBand="0" w:evenVBand="0" w:oddHBand="0" w:evenHBand="0" w:firstRowFirstColumn="0" w:firstRowLastColumn="0" w:lastRowFirstColumn="0" w:lastRowLastColumn="0"/>
-              <w:rPr>
-                <w:sz w:val="16"/>
-                <w:szCs w:val="16"/>
-                <w:lang w:val="da-DK"/>
-              </w:rPr>
-            </w:pPr>
-            <w:r>
-              <w:rPr>
-                <w:sz w:val="16"/>
-                <w:szCs w:val="16"/>
-                <w:lang w:val="da-DK"/>
-              </w:rPr>
-              <w:t>Såfremt den angive attribut er udfyldt med ”true” så vil integrationen sætte alle IDM undtagelsesmarkeringer på personen i OS2sofd.</w:t>
+              <w:rPr>
+                <w:sz w:val="16"/>
+                <w:szCs w:val="16"/>
+                <w:lang w:val="da-DK"/>
+              </w:rPr>
+            </w:pPr>
+            <w:r>
+              <w:rPr>
+                <w:sz w:val="16"/>
+                <w:szCs w:val="16"/>
+                <w:lang w:val="da-DK"/>
+              </w:rPr>
+              <w:t xml:space="preserve">Såfremt den angive attribut er udfyldt med ”true” så vil integrationen sætte alle </w:t>
+            </w:r>
+            <w:r>
+              <w:rPr>
+                <w:sz w:val="16"/>
+                <w:szCs w:val="16"/>
+                <w:lang w:val="da-DK"/>
+              </w:rPr>
+              <w:t xml:space="preserve">IDM </w:t>
+            </w:r>
+            <w:r>
+              <w:rPr>
+                <w:sz w:val="16"/>
+                <w:szCs w:val="16"/>
+                <w:lang w:val="da-DK"/>
+              </w:rPr>
+              <w:t>undtagelsesmarkeringer på personen i OS2sofd.</w:t>
             </w:r>
             <w:r>
               <w:rPr>
@@ -5186,6 +4940,7 @@
           <w:tcPr>
             <w:cnfStyle w:val="001000000000" w:firstRow="0" w:lastRow="0" w:firstColumn="1" w:lastColumn="0" w:oddVBand="0" w:evenVBand="0" w:oddHBand="0" w:evenHBand="0" w:firstRowFirstColumn="0" w:firstRowLastColumn="0" w:lastRowFirstColumn="0" w:lastRowLastColumn="0"/>
             <w:tcW w:w="4248" w:type="dxa"/>
+            <w:shd w:val="clear" w:color="auto" w:fill="auto"/>
           </w:tcPr>
           <w:p>
             <w:pPr>
@@ -5212,6 +4967,7 @@
         <w:tc>
           <w:tcPr>
             <w:tcW w:w="1984" w:type="dxa"/>
+            <w:shd w:val="clear" w:color="auto" w:fill="auto"/>
           </w:tcPr>
           <w:p>
             <w:pPr>
@@ -5235,6 +4991,7 @@
         <w:tc>
           <w:tcPr>
             <w:tcW w:w="3396" w:type="dxa"/>
+            <w:shd w:val="clear" w:color="auto" w:fill="auto"/>
           </w:tcPr>
           <w:p>
             <w:pPr>
@@ -5261,6 +5018,7 @@
           <w:tcPr>
             <w:cnfStyle w:val="001000000000" w:firstRow="0" w:lastRow="0" w:firstColumn="1" w:lastColumn="0" w:oddVBand="0" w:evenVBand="0" w:oddHBand="0" w:evenHBand="0" w:firstRowFirstColumn="0" w:firstRowLastColumn="0" w:lastRowFirstColumn="0" w:lastRowLastColumn="0"/>
             <w:tcW w:w="4248" w:type="dxa"/>
+            <w:shd w:val="clear" w:color="auto" w:fill="auto"/>
           </w:tcPr>
           <w:p>
             <w:pPr>
@@ -5287,6 +5045,7 @@
         <w:tc>
           <w:tcPr>
             <w:tcW w:w="1984" w:type="dxa"/>
+            <w:shd w:val="clear" w:color="auto" w:fill="auto"/>
           </w:tcPr>
           <w:p>
             <w:pPr>
@@ -5313,6 +5072,7 @@
         <w:tc>
           <w:tcPr>
             <w:tcW w:w="3396" w:type="dxa"/>
+            <w:shd w:val="clear" w:color="auto" w:fill="auto"/>
           </w:tcPr>
           <w:p>
             <w:pPr>
@@ -5339,6 +5099,7 @@
           <w:tcPr>
             <w:cnfStyle w:val="001000000000" w:firstRow="0" w:lastRow="0" w:firstColumn="1" w:lastColumn="0" w:oddVBand="0" w:evenVBand="0" w:oddHBand="0" w:evenHBand="0" w:firstRowFirstColumn="0" w:firstRowLastColumn="0" w:lastRowFirstColumn="0" w:lastRowLastColumn="0"/>
             <w:tcW w:w="4248" w:type="dxa"/>
+            <w:shd w:val="clear" w:color="auto" w:fill="auto"/>
           </w:tcPr>
           <w:p>
             <w:pPr>
@@ -5365,6 +5126,7 @@
         <w:tc>
           <w:tcPr>
             <w:tcW w:w="1984" w:type="dxa"/>
+            <w:shd w:val="clear" w:color="auto" w:fill="auto"/>
           </w:tcPr>
           <w:p>
             <w:pPr>
@@ -5388,6 +5150,7 @@
         <w:tc>
           <w:tcPr>
             <w:tcW w:w="3396" w:type="dxa"/>
+            <w:shd w:val="clear" w:color="auto" w:fill="auto"/>
           </w:tcPr>
           <w:p>
             <w:pPr>
@@ -5427,40 +5190,40 @@
         <w:rPr>
           <w:lang w:val="da-DK"/>
         </w:rPr>
+        <w:t xml:space="preserve">Såfremt </w:t>
+      </w:r>
+      <w:r>
+        <w:rPr>
+          <w:b/>
+          <w:lang w:val="da-DK"/>
+        </w:rPr>
+        <w:t>ActiveDirectory.IntegratedSecurity</w:t>
+      </w:r>
+      <w:r>
+        <w:rPr>
+          <w:lang w:val="da-DK"/>
+        </w:rPr>
+        <w:t xml:space="preserve"> er sat til “true” I xml-konfigurationen skal se</w:t>
+      </w:r>
+      <w:r>
+        <w:rPr>
+          <w:lang w:val="da-DK"/>
+        </w:rPr>
+        <w:t>rvice kontoen angives på ”Log On” fanen i Windows Services.</w:t>
+      </w:r>
+    </w:p>
+    <w:p>
+      <w:pPr>
+        <w:rPr>
+          <w:lang w:val="da-DK"/>
+        </w:rPr>
+      </w:pPr>
+      <w:r>
+        <w:rPr>
+          <w:noProof/>
+          <w:lang w:val="da-DK"/>
+        </w:rPr>
         <w:lastRenderedPageBreak/>
-        <w:t xml:space="preserve">Såfremt </w:t>
-      </w:r>
-      <w:r>
-        <w:rPr>
-          <w:b/>
-          <w:lang w:val="da-DK"/>
-        </w:rPr>
-        <w:t>ActiveDirectory.IntegratedSecurity</w:t>
-      </w:r>
-      <w:r>
-        <w:rPr>
-          <w:lang w:val="da-DK"/>
-        </w:rPr>
-        <w:t xml:space="preserve"> er sat til “true” I xml-konfigurationen skal se</w:t>
-      </w:r>
-      <w:r>
-        <w:rPr>
-          <w:lang w:val="da-DK"/>
-        </w:rPr>
-        <w:t>rvice kontoen angives på ”Log On” fanen i Windows Services.</w:t>
-      </w:r>
-    </w:p>
-    <w:p>
-      <w:pPr>
-        <w:rPr>
-          <w:lang w:val="da-DK"/>
-        </w:rPr>
-      </w:pPr>
-      <w:r>
-        <w:rPr>
-          <w:noProof/>
-          <w:lang w:val="da-DK"/>
-        </w:rPr>
         <w:drawing>
           <wp:inline distT="0" distB="0" distL="0" distR="0" wp14:anchorId="25B9F0F1" wp14:editId="695D0F43">
             <wp:extent cx="3868714" cy="4459503"/>
@@ -5666,7 +5429,6 @@
           <w:sz w:val="16"/>
           <w:szCs w:val="16"/>
         </w:rPr>
-        <w:lastRenderedPageBreak/>
         <w:t>2019-09-04 06:00:04 [Information] [</w:t>
       </w:r>
       <w:proofErr w:type="spellStart"/>
@@ -5698,6 +5460,7 @@
           <w:sz w:val="16"/>
           <w:szCs w:val="16"/>
         </w:rPr>
+        <w:lastRenderedPageBreak/>
         <w:t>2019-09-04 06:00:06 [Information] [</w:t>
       </w:r>
       <w:proofErr w:type="spellStart"/>

</xml_diff>

<commit_message>
added validation to email templates
</commit_message>
<xml_diff>
--- a/doc/SOFD Core - AD indlaesningsintegration.docx
+++ b/doc/SOFD Core - AD indlaesningsintegration.docx
@@ -152,7 +152,7 @@
         <w:t>1.</w:t>
       </w:r>
       <w:r>
-        <w:t>9</w:t>
+        <w:t>10</w:t>
       </w:r>
       <w:r>
         <w:t>.0</w:t>
@@ -174,7 +174,9 @@
       </w:r>
       <w:r>
         <w:tab/>
-        <w:t>07</w:t>
+      </w:r>
+      <w:r>
+        <w:t>03</w:t>
       </w:r>
       <w:r>
         <w:t>.</w:t>
@@ -183,7 +185,7 @@
         <w:t>0</w:t>
       </w:r>
       <w:r>
-        <w:t>3</w:t>
+        <w:t>1</w:t>
       </w:r>
       <w:r>
         <w:t>.20</w:t>
@@ -192,7 +194,7 @@
         <w:t>2</w:t>
       </w:r>
       <w:r>
-        <w:t>2</w:t>
+        <w:t>5</w:t>
       </w:r>
     </w:p>
     <w:p>
@@ -213,7 +215,7 @@
         <w:tab/>
       </w:r>
       <w:r>
-        <w:t>BSG</w:t>
+        <w:t>PSO</w:t>
       </w:r>
     </w:p>
     <w:p>
@@ -1126,7 +1128,23 @@
                 <w:noProof/>
                 <w:lang w:val="da-DK"/>
               </w:rPr>
-              <w:t>Konfiguration af service</w:t>
+              <w:t>Konfigu</w:t>
+            </w:r>
+            <w:r>
+              <w:rPr>
+                <w:rStyle w:val="Hyperlink"/>
+                <w:noProof/>
+                <w:lang w:val="da-DK"/>
+              </w:rPr>
+              <w:t>r</w:t>
+            </w:r>
+            <w:r>
+              <w:rPr>
+                <w:rStyle w:val="Hyperlink"/>
+                <w:noProof/>
+                <w:lang w:val="da-DK"/>
+              </w:rPr>
+              <w:t>ation af service</w:t>
             </w:r>
             <w:r>
               <w:rPr>
@@ -4656,7 +4674,7 @@
                 <w:sz w:val="16"/>
                 <w:szCs w:val="16"/>
               </w:rPr>
-              <w:t>”OU=old</w:t>
+              <w:t>OU=old</w:t>
             </w:r>
             <w:r>
               <w:rPr>
@@ -4743,7 +4761,7 @@
                 <w:sz w:val="16"/>
                 <w:szCs w:val="16"/>
               </w:rPr>
-              <w:t>=dk”</w:t>
+              <w:t>=dk</w:t>
             </w:r>
           </w:p>
         </w:tc>
@@ -4766,7 +4784,23 @@
                 <w:szCs w:val="16"/>
                 <w:lang w:val="da-DK"/>
               </w:rPr>
-              <w:t xml:space="preserve">En ;-separeret liste af enheders distinguished name. Brugere i enhederne, der listes her, bliver ikke synkroniseret.  </w:t>
+              <w:t xml:space="preserve">En </w:t>
+            </w:r>
+            <w:r>
+              <w:rPr>
+                <w:sz w:val="16"/>
+                <w:szCs w:val="16"/>
+                <w:lang w:val="da-DK"/>
+              </w:rPr>
+              <w:t>semikolon</w:t>
+            </w:r>
+            <w:r>
+              <w:rPr>
+                <w:sz w:val="16"/>
+                <w:szCs w:val="16"/>
+                <w:lang w:val="da-DK"/>
+              </w:rPr>
+              <w:t xml:space="preserve">-separeret liste af enheders distinguished name. Brugere i enhederne, der listes her, bliver ikke synkroniseret.  </w:t>
             </w:r>
           </w:p>
         </w:tc>
@@ -4774,19 +4808,26 @@
       <w:tr>
         <w:tc>
           <w:tcPr>
+            <w:cnfStyle w:val="001000000000" w:firstRow="0" w:lastRow="0" w:firstColumn="1" w:lastColumn="0" w:oddVBand="0" w:evenVBand="0" w:oddHBand="0" w:evenHBand="0" w:firstRowFirstColumn="0" w:firstRowLastColumn="0" w:lastRowFirstColumn="0" w:lastRowLastColumn="0"/>
             <w:tcW w:w="4248" w:type="dxa"/>
           </w:tcPr>
           <w:p>
             <w:pPr>
-              <w:cnfStyle w:val="001000000000" w:firstRow="0" w:lastRow="0" w:firstColumn="1" w:lastColumn="0" w:oddVBand="0" w:evenVBand="0" w:oddHBand="0" w:evenHBand="0" w:firstRowFirstColumn="0" w:firstRowLastColumn="0" w:lastRowFirstColumn="0" w:lastRowLastColumn="0"/>
+              <w:rPr>
+                <w:sz w:val="16"/>
+                <w:szCs w:val="16"/>
+              </w:rPr>
+            </w:pPr>
+            <w:proofErr w:type="spellStart"/>
+            <w:r>
               <w:rPr>
                 <w:b w:val="0"/>
                 <w:bCs w:val="0"/>
                 <w:sz w:val="16"/>
                 <w:szCs w:val="16"/>
               </w:rPr>
-            </w:pPr>
-            <w:proofErr w:type="spellStart"/>
+              <w:t>ActiveDirectory.</w:t>
+            </w:r>
             <w:r>
               <w:rPr>
                 <w:b w:val="0"/>
@@ -4794,6 +4835,225 @@
                 <w:sz w:val="16"/>
                 <w:szCs w:val="16"/>
               </w:rPr>
+              <w:t>In</w:t>
+            </w:r>
+            <w:r>
+              <w:rPr>
+                <w:b w:val="0"/>
+                <w:bCs w:val="0"/>
+                <w:sz w:val="16"/>
+                <w:szCs w:val="16"/>
+              </w:rPr>
+              <w:t>cludeOUs</w:t>
+            </w:r>
+            <w:proofErr w:type="spellEnd"/>
+          </w:p>
+        </w:tc>
+        <w:tc>
+          <w:tcPr>
+            <w:tcW w:w="1984" w:type="dxa"/>
+          </w:tcPr>
+          <w:p>
+            <w:pPr>
+              <w:cnfStyle w:val="000000000000" w:firstRow="0" w:lastRow="0" w:firstColumn="0" w:lastColumn="0" w:oddVBand="0" w:evenVBand="0" w:oddHBand="0" w:evenHBand="0" w:firstRowFirstColumn="0" w:firstRowLastColumn="0" w:lastRowFirstColumn="0" w:lastRowLastColumn="0"/>
+              <w:rPr>
+                <w:sz w:val="16"/>
+                <w:szCs w:val="16"/>
+              </w:rPr>
+            </w:pPr>
+            <w:r>
+              <w:rPr>
+                <w:sz w:val="16"/>
+                <w:szCs w:val="16"/>
+              </w:rPr>
+              <w:t xml:space="preserve">OU=old </w:t>
+            </w:r>
+            <w:proofErr w:type="spellStart"/>
+            <w:r>
+              <w:rPr>
+                <w:sz w:val="16"/>
+                <w:szCs w:val="16"/>
+              </w:rPr>
+              <w:t>users,OU</w:t>
+            </w:r>
+            <w:proofErr w:type="spellEnd"/>
+            <w:r>
+              <w:rPr>
+                <w:sz w:val="16"/>
+                <w:szCs w:val="16"/>
+              </w:rPr>
+              <w:t>=</w:t>
+            </w:r>
+            <w:proofErr w:type="spellStart"/>
+            <w:r>
+              <w:rPr>
+                <w:sz w:val="16"/>
+                <w:szCs w:val="16"/>
+              </w:rPr>
+              <w:t>testkøbing,DC</w:t>
+            </w:r>
+            <w:proofErr w:type="spellEnd"/>
+            <w:r>
+              <w:rPr>
+                <w:sz w:val="16"/>
+                <w:szCs w:val="16"/>
+              </w:rPr>
+              <w:t>=</w:t>
+            </w:r>
+            <w:proofErr w:type="spellStart"/>
+            <w:r>
+              <w:rPr>
+                <w:sz w:val="16"/>
+                <w:szCs w:val="16"/>
+              </w:rPr>
+              <w:t>test,DC</w:t>
+            </w:r>
+            <w:proofErr w:type="spellEnd"/>
+            <w:r>
+              <w:rPr>
+                <w:sz w:val="16"/>
+                <w:szCs w:val="16"/>
+              </w:rPr>
+              <w:t>=dk; OU=old users 2,OU=</w:t>
+            </w:r>
+            <w:proofErr w:type="spellStart"/>
+            <w:r>
+              <w:rPr>
+                <w:sz w:val="16"/>
+                <w:szCs w:val="16"/>
+              </w:rPr>
+              <w:t>testkøbing,DC</w:t>
+            </w:r>
+            <w:proofErr w:type="spellEnd"/>
+            <w:r>
+              <w:rPr>
+                <w:sz w:val="16"/>
+                <w:szCs w:val="16"/>
+              </w:rPr>
+              <w:t>=</w:t>
+            </w:r>
+            <w:proofErr w:type="spellStart"/>
+            <w:r>
+              <w:rPr>
+                <w:sz w:val="16"/>
+                <w:szCs w:val="16"/>
+              </w:rPr>
+              <w:t>test,DC</w:t>
+            </w:r>
+            <w:proofErr w:type="spellEnd"/>
+            <w:r>
+              <w:rPr>
+                <w:sz w:val="16"/>
+                <w:szCs w:val="16"/>
+              </w:rPr>
+              <w:t>=dk</w:t>
+            </w:r>
+          </w:p>
+        </w:tc>
+        <w:tc>
+          <w:tcPr>
+            <w:tcW w:w="3396" w:type="dxa"/>
+          </w:tcPr>
+          <w:p>
+            <w:pPr>
+              <w:cnfStyle w:val="000000000000" w:firstRow="0" w:lastRow="0" w:firstColumn="0" w:lastColumn="0" w:oddVBand="0" w:evenVBand="0" w:oddHBand="0" w:evenHBand="0" w:firstRowFirstColumn="0" w:firstRowLastColumn="0" w:lastRowFirstColumn="0" w:lastRowLastColumn="0"/>
+              <w:rPr>
+                <w:sz w:val="16"/>
+                <w:szCs w:val="16"/>
+                <w:lang w:val="da-DK"/>
+              </w:rPr>
+            </w:pPr>
+            <w:r>
+              <w:rPr>
+                <w:sz w:val="16"/>
+                <w:szCs w:val="16"/>
+                <w:lang w:val="da-DK"/>
+              </w:rPr>
+              <w:t xml:space="preserve">En </w:t>
+            </w:r>
+            <w:r>
+              <w:rPr>
+                <w:sz w:val="16"/>
+                <w:szCs w:val="16"/>
+                <w:lang w:val="da-DK"/>
+              </w:rPr>
+              <w:t>semikolon</w:t>
+            </w:r>
+            <w:r>
+              <w:rPr>
+                <w:sz w:val="16"/>
+                <w:szCs w:val="16"/>
+                <w:lang w:val="da-DK"/>
+              </w:rPr>
+              <w:t xml:space="preserve">-separeret liste af enheders distinguished name. </w:t>
+            </w:r>
+            <w:r>
+              <w:rPr>
+                <w:sz w:val="16"/>
+                <w:szCs w:val="16"/>
+                <w:lang w:val="da-DK"/>
+              </w:rPr>
+              <w:br/>
+              <w:t>Såfremt denne liste ikke er tom, er det kun b</w:t>
+            </w:r>
+            <w:r>
+              <w:rPr>
+                <w:sz w:val="16"/>
+                <w:szCs w:val="16"/>
+                <w:lang w:val="da-DK"/>
+              </w:rPr>
+              <w:t xml:space="preserve">rugere </w:t>
+            </w:r>
+            <w:r>
+              <w:rPr>
+                <w:sz w:val="16"/>
+                <w:szCs w:val="16"/>
+                <w:lang w:val="da-DK"/>
+              </w:rPr>
+              <w:t xml:space="preserve">under disse OUer der bliver </w:t>
+            </w:r>
+            <w:r>
+              <w:rPr>
+                <w:sz w:val="16"/>
+                <w:szCs w:val="16"/>
+                <w:lang w:val="da-DK"/>
+              </w:rPr>
+              <w:t>synkroniseret.</w:t>
+            </w:r>
+            <w:r>
+              <w:rPr>
+                <w:sz w:val="16"/>
+                <w:szCs w:val="16"/>
+                <w:lang w:val="da-DK"/>
+              </w:rPr>
+              <w:t xml:space="preserve"> </w:t>
+            </w:r>
+          </w:p>
+        </w:tc>
+      </w:tr>
+      <w:tr>
+        <w:tc>
+          <w:tcPr>
+            <w:cnfStyle w:val="001000000000" w:firstRow="0" w:lastRow="0" w:firstColumn="1" w:lastColumn="0" w:oddVBand="0" w:evenVBand="0" w:oddHBand="0" w:evenHBand="0" w:firstRowFirstColumn="0" w:firstRowLastColumn="0" w:lastRowFirstColumn="0" w:lastRowLastColumn="0"/>
+            <w:tcW w:w="4248" w:type="dxa"/>
+          </w:tcPr>
+          <w:p>
+            <w:pPr>
+              <w:rPr>
+                <w:b w:val="0"/>
+                <w:bCs w:val="0"/>
+                <w:sz w:val="16"/>
+                <w:szCs w:val="16"/>
+              </w:rPr>
+            </w:pPr>
+            <w:proofErr w:type="spellStart"/>
+            <w:r>
+              <w:rPr>
+                <w:b w:val="0"/>
+                <w:bCs w:val="0"/>
+                <w:sz w:val="16"/>
+                <w:szCs w:val="16"/>
+              </w:rPr>
               <w:t>ActiveDirectory.DisableAccountOrdersAttribute</w:t>
             </w:r>
             <w:proofErr w:type="spellEnd"/>
@@ -4805,6 +5065,7 @@
           </w:tcPr>
           <w:p>
             <w:pPr>
+              <w:cnfStyle w:val="000000000000" w:firstRow="0" w:lastRow="0" w:firstColumn="0" w:lastColumn="0" w:oddVBand="0" w:evenVBand="0" w:oddHBand="0" w:evenHBand="0" w:firstRowFirstColumn="0" w:firstRowLastColumn="0" w:lastRowFirstColumn="0" w:lastRowLastColumn="0"/>
               <w:rPr>
                 <w:sz w:val="16"/>
                 <w:szCs w:val="16"/>
@@ -4825,35 +5086,20 @@
           </w:tcPr>
           <w:p>
             <w:pPr>
-              <w:rPr>
-                <w:sz w:val="16"/>
-                <w:szCs w:val="16"/>
-                <w:lang w:val="da-DK"/>
-              </w:rPr>
-            </w:pPr>
-            <w:r>
-              <w:rPr>
-                <w:sz w:val="16"/>
-                <w:szCs w:val="16"/>
-                <w:lang w:val="da-DK"/>
-              </w:rPr>
-              <w:t xml:space="preserve">Såfremt den angive attribut er udfyldt med ”true” så vil integrationen sætte alle </w:t>
-            </w:r>
-            <w:r>
-              <w:rPr>
-                <w:sz w:val="16"/>
-                <w:szCs w:val="16"/>
-                <w:lang w:val="da-DK"/>
-              </w:rPr>
-              <w:t xml:space="preserve">IDM </w:t>
-            </w:r>
-            <w:r>
-              <w:rPr>
-                <w:sz w:val="16"/>
-                <w:szCs w:val="16"/>
-                <w:lang w:val="da-DK"/>
-              </w:rPr>
-              <w:t>undtagelsesmarkeringer på personen i OS2sofd.</w:t>
+              <w:cnfStyle w:val="000000000000" w:firstRow="0" w:lastRow="0" w:firstColumn="0" w:lastColumn="0" w:oddVBand="0" w:evenVBand="0" w:oddHBand="0" w:evenHBand="0" w:firstRowFirstColumn="0" w:firstRowLastColumn="0" w:lastRowFirstColumn="0" w:lastRowLastColumn="0"/>
+              <w:rPr>
+                <w:sz w:val="16"/>
+                <w:szCs w:val="16"/>
+                <w:lang w:val="da-DK"/>
+              </w:rPr>
+            </w:pPr>
+            <w:r>
+              <w:rPr>
+                <w:sz w:val="16"/>
+                <w:szCs w:val="16"/>
+                <w:lang w:val="da-DK"/>
+              </w:rPr>
+              <w:t>Såfremt den angive attribut er udfyldt med ”true” så vil integrationen sætte alle IDM undtagelsesmarkeringer på personen i OS2sofd.</w:t>
             </w:r>
             <w:r>
               <w:rPr>
@@ -4940,7 +5186,6 @@
           <w:tcPr>
             <w:cnfStyle w:val="001000000000" w:firstRow="0" w:lastRow="0" w:firstColumn="1" w:lastColumn="0" w:oddVBand="0" w:evenVBand="0" w:oddHBand="0" w:evenHBand="0" w:firstRowFirstColumn="0" w:firstRowLastColumn="0" w:lastRowFirstColumn="0" w:lastRowLastColumn="0"/>
             <w:tcW w:w="4248" w:type="dxa"/>
-            <w:shd w:val="clear" w:color="auto" w:fill="auto"/>
           </w:tcPr>
           <w:p>
             <w:pPr>
@@ -4967,7 +5212,6 @@
         <w:tc>
           <w:tcPr>
             <w:tcW w:w="1984" w:type="dxa"/>
-            <w:shd w:val="clear" w:color="auto" w:fill="auto"/>
           </w:tcPr>
           <w:p>
             <w:pPr>
@@ -4991,7 +5235,6 @@
         <w:tc>
           <w:tcPr>
             <w:tcW w:w="3396" w:type="dxa"/>
-            <w:shd w:val="clear" w:color="auto" w:fill="auto"/>
           </w:tcPr>
           <w:p>
             <w:pPr>
@@ -5018,7 +5261,6 @@
           <w:tcPr>
             <w:cnfStyle w:val="001000000000" w:firstRow="0" w:lastRow="0" w:firstColumn="1" w:lastColumn="0" w:oddVBand="0" w:evenVBand="0" w:oddHBand="0" w:evenHBand="0" w:firstRowFirstColumn="0" w:firstRowLastColumn="0" w:lastRowFirstColumn="0" w:lastRowLastColumn="0"/>
             <w:tcW w:w="4248" w:type="dxa"/>
-            <w:shd w:val="clear" w:color="auto" w:fill="auto"/>
           </w:tcPr>
           <w:p>
             <w:pPr>
@@ -5045,7 +5287,6 @@
         <w:tc>
           <w:tcPr>
             <w:tcW w:w="1984" w:type="dxa"/>
-            <w:shd w:val="clear" w:color="auto" w:fill="auto"/>
           </w:tcPr>
           <w:p>
             <w:pPr>
@@ -5072,7 +5313,6 @@
         <w:tc>
           <w:tcPr>
             <w:tcW w:w="3396" w:type="dxa"/>
-            <w:shd w:val="clear" w:color="auto" w:fill="auto"/>
           </w:tcPr>
           <w:p>
             <w:pPr>
@@ -5099,7 +5339,6 @@
           <w:tcPr>
             <w:cnfStyle w:val="001000000000" w:firstRow="0" w:lastRow="0" w:firstColumn="1" w:lastColumn="0" w:oddVBand="0" w:evenVBand="0" w:oddHBand="0" w:evenHBand="0" w:firstRowFirstColumn="0" w:firstRowLastColumn="0" w:lastRowFirstColumn="0" w:lastRowLastColumn="0"/>
             <w:tcW w:w="4248" w:type="dxa"/>
-            <w:shd w:val="clear" w:color="auto" w:fill="auto"/>
           </w:tcPr>
           <w:p>
             <w:pPr>
@@ -5126,7 +5365,6 @@
         <w:tc>
           <w:tcPr>
             <w:tcW w:w="1984" w:type="dxa"/>
-            <w:shd w:val="clear" w:color="auto" w:fill="auto"/>
           </w:tcPr>
           <w:p>
             <w:pPr>
@@ -5150,7 +5388,6 @@
         <w:tc>
           <w:tcPr>
             <w:tcW w:w="3396" w:type="dxa"/>
-            <w:shd w:val="clear" w:color="auto" w:fill="auto"/>
           </w:tcPr>
           <w:p>
             <w:pPr>
@@ -5190,6 +5427,7 @@
         <w:rPr>
           <w:lang w:val="da-DK"/>
         </w:rPr>
+        <w:lastRenderedPageBreak/>
         <w:t xml:space="preserve">Såfremt </w:t>
       </w:r>
       <w:r>
@@ -5223,7 +5461,6 @@
           <w:noProof/>
           <w:lang w:val="da-DK"/>
         </w:rPr>
-        <w:lastRenderedPageBreak/>
         <w:drawing>
           <wp:inline distT="0" distB="0" distL="0" distR="0" wp14:anchorId="25B9F0F1" wp14:editId="695D0F43">
             <wp:extent cx="3868714" cy="4459503"/>
@@ -5429,6 +5666,7 @@
           <w:sz w:val="16"/>
           <w:szCs w:val="16"/>
         </w:rPr>
+        <w:lastRenderedPageBreak/>
         <w:t>2019-09-04 06:00:04 [Information] [</w:t>
       </w:r>
       <w:proofErr w:type="spellStart"/>
@@ -5460,7 +5698,6 @@
           <w:sz w:val="16"/>
           <w:szCs w:val="16"/>
         </w:rPr>
-        <w:lastRenderedPageBreak/>
         <w:t>2019-09-04 06:00:06 [Information] [</w:t>
       </w:r>
       <w:proofErr w:type="spellStart"/>

</xml_diff>